<commit_message>
Pedido oral: ausência de procuração do autor e opção dele pelo rito da Lei 9.099
Co-Authored-By: Claude Opus 5.5 <noreply@anthropic.com>
Claude-Session: https://claude.ai/code/session_01CUmiv8ZKDC5VxLQ3BigcLo
</commit_message>
<xml_diff>
--- a/0800990-83.2026 - Ely Sandro/Pedido oral - audiência de conciliação 22-10-2026.docx
+++ b/0800990-83.2026 - Ely Sandro/Pedido oral - audiência de conciliação 22-10-2026.docx
@@ -138,23 +138,38 @@
         <w:pStyle w:val="BodyText"/>
       </w:pPr>
       <w:r>
-        <w:t xml:space="preserve">☐ Conferir se a</w:t>
-      </w:r>
-      <w:r>
-        <w:t xml:space="preserve"> </w:t>
-      </w:r>
-      <w:r>
-        <w:rPr>
-          <w:bCs/>
-          <w:b/>
-        </w:rPr>
-        <w:t xml:space="preserve">procuração do autor</w:t>
-      </w:r>
-      <w:r>
-        <w:t xml:space="preserve"> </w:t>
-      </w:r>
-      <w:r>
-        <w:t xml:space="preserve">tem poderes especiais para transigir (relevante para rebater o precedente do TJSP).</w:t>
+        <w:t xml:space="preserve">☐</w:t>
+      </w:r>
+      <w:r>
+        <w:t xml:space="preserve"> </w:t>
+      </w:r>
+      <w:r>
+        <w:rPr>
+          <w:bCs/>
+          <w:b/>
+        </w:rPr>
+        <w:t xml:space="preserve">Não há procuração do autor nos autos</w:t>
+      </w:r>
+      <w:r>
+        <w:t xml:space="preserve"> </w:t>
+      </w:r>
+      <w:r>
+        <w:t xml:space="preserve">(a inicial diz</w:t>
+      </w:r>
+      <w:r>
+        <w:t xml:space="preserve"> </w:t>
+      </w:r>
+      <w:r>
+        <w:t xml:space="preserve">“</w:t>
+      </w:r>
+      <w:r>
+        <w:t xml:space="preserve">procuração em anexo</w:t>
+      </w:r>
+      <w:r>
+        <w:t xml:space="preserve">”</w:t>
+      </w:r>
+      <w:r>
+        <w:t xml:space="preserve">, mas nenhum dos documentos de 08/07/2026 é procuração). Conferir no PJe, antes do ato, se houve juntada posterior.</w:t>
       </w:r>
     </w:p>
     <w:p>
@@ -288,7 +303,56 @@
         <w:t xml:space="preserve">art. 54 da Lei nº 9.099/1995</w:t>
       </w:r>
       <w:r>
-        <w:t xml:space="preserve">). Quem se vale das vantagens do rito sujeita-se também às suas regras. A remissão ao art. 231 do CPC, feita pelo Juízo apenas para fixar o termo inicial do prazo de defesa, não altera o rito do processo.</w:t>
+        <w:t xml:space="preserve">). Quem se vale das vantagens do rito sujeita-se também às suas regras. A remissão ao art. 231 do CPC, feita pelo Juízo apenas para fixar o termo inicial do prazo de defesa, não altera o rito do processo. E foi o</w:t>
+      </w:r>
+      <w:r>
+        <w:t xml:space="preserve"> </w:t>
+      </w:r>
+      <w:r>
+        <w:rPr>
+          <w:bCs/>
+          <w:b/>
+        </w:rPr>
+        <w:t xml:space="preserve">próprio autor quem escolheu esse rito</w:t>
+      </w:r>
+      <w:r>
+        <w:t xml:space="preserve">: a inicial dedica um capítulo à</w:t>
+      </w:r>
+      <w:r>
+        <w:t xml:space="preserve"> </w:t>
+      </w:r>
+      <w:r>
+        <w:t xml:space="preserve">“</w:t>
+      </w:r>
+      <w:r>
+        <w:t xml:space="preserve">opção pelo rito sumaríssimo da Lei nº 9.099/1995</w:t>
+      </w:r>
+      <w:r>
+        <w:t xml:space="preserve">”</w:t>
+      </w:r>
+      <w:r>
+        <w:t xml:space="preserve"> </w:t>
+      </w:r>
+      <w:r>
+        <w:t xml:space="preserve">(item II), invoca os arts. 8º e 9º dessa lei e pede expressamente</w:t>
+      </w:r>
+      <w:r>
+        <w:t xml:space="preserve"> </w:t>
+      </w:r>
+      <w:r>
+        <w:t xml:space="preserve">“</w:t>
+      </w:r>
+      <w:r>
+        <w:t xml:space="preserve">a concessão dos benefícios do processamento pelo rito da Lei nº 9.099/1995</w:t>
+      </w:r>
+      <w:r>
+        <w:t xml:space="preserve">”</w:t>
+      </w:r>
+      <w:r>
+        <w:t xml:space="preserve"> </w:t>
+      </w:r>
+      <w:r>
+        <w:t xml:space="preserve">(pedido 5).</w:t>
       </w:r>
     </w:p>
     <w:p>
@@ -485,6 +549,87 @@
         <w:pStyle w:val="BlockText"/>
       </w:pPr>
       <w:r>
+        <w:t xml:space="preserve">Há mais, Excelência:</w:t>
+      </w:r>
+      <w:r>
+        <w:t xml:space="preserve"> </w:t>
+      </w:r>
+      <w:r>
+        <w:rPr>
+          <w:bCs/>
+          <w:b/>
+        </w:rPr>
+        <w:t xml:space="preserve">não há procuração do autor nos autos</w:t>
+      </w:r>
+      <w:r>
+        <w:t xml:space="preserve">. A inicial afirma</w:t>
+      </w:r>
+      <w:r>
+        <w:t xml:space="preserve"> </w:t>
+      </w:r>
+      <w:r>
+        <w:t xml:space="preserve">“</w:t>
+      </w:r>
+      <w:r>
+        <w:t xml:space="preserve">procuração em anexo</w:t>
+      </w:r>
+      <w:r>
+        <w:t xml:space="preserve">”</w:t>
+      </w:r>
+      <w:r>
+        <w:t xml:space="preserve">, mas nenhum dos documentos que a instruem é instrumento de mandato. O advogado presente, portanto,</w:t>
+      </w:r>
+      <w:r>
+        <w:t xml:space="preserve"> </w:t>
+      </w:r>
+      <w:r>
+        <w:rPr>
+          <w:bCs/>
+          <w:b/>
+        </w:rPr>
+        <w:t xml:space="preserve">não tem mandato</w:t>
+      </w:r>
+      <w:r>
+        <w:t xml:space="preserve"> </w:t>
+      </w:r>
+      <w:r>
+        <w:t xml:space="preserve">para representar o autor, muito menos</w:t>
+      </w:r>
+      <w:r>
+        <w:t xml:space="preserve"> </w:t>
+      </w:r>
+      <w:r>
+        <w:rPr>
+          <w:bCs/>
+          <w:b/>
+        </w:rPr>
+        <w:t xml:space="preserve">poderes especiais para transigir</w:t>
+      </w:r>
+      <w:r>
+        <w:t xml:space="preserve">, que nos Juizados</w:t>
+      </w:r>
+      <w:r>
+        <w:t xml:space="preserve"> </w:t>
+      </w:r>
+      <w:r>
+        <w:rPr>
+          <w:bCs/>
+          <w:b/>
+        </w:rPr>
+        <w:t xml:space="preserve">não podem ser conferidos verbalmente</w:t>
+      </w:r>
+      <w:r>
+        <w:t xml:space="preserve"> </w:t>
+      </w:r>
+      <w:r>
+        <w:t xml:space="preserve">(art. 9º, § 3º, da Lei 9.099/95; art. 105 do CPC). E o mandato verbal só poderia ser outorgado pelo próprio autor, que não está presente. Não há, assim, quem fale validamente em nome do autor neste ato.</w:t>
+      </w:r>
+    </w:p>
+    <w:p>
+      <w:pPr>
+        <w:pStyle w:val="BlockText"/>
+      </w:pPr>
+      <w:r>
         <w:t xml:space="preserve">Diante disso, requer:</w:t>
       </w:r>
     </w:p>
@@ -661,6 +806,69 @@
         <w:t xml:space="preserve"> </w:t>
       </w:r>
       <w:r>
+        <w:t xml:space="preserve">o</w:t>
+      </w:r>
+      <w:r>
+        <w:t xml:space="preserve"> </w:t>
+      </w:r>
+      <w:r>
+        <w:rPr>
+          <w:bCs/>
+          <w:b/>
+        </w:rPr>
+        <w:t xml:space="preserve">registro em ata da ausência de procuração do autor nos autos</w:t>
+      </w:r>
+      <w:r>
+        <w:t xml:space="preserve">, e, caso não acolhida a extinção pelo art. 51, I, a</w:t>
+      </w:r>
+      <w:r>
+        <w:t xml:space="preserve"> </w:t>
+      </w:r>
+      <w:r>
+        <w:rPr>
+          <w:bCs/>
+          <w:b/>
+        </w:rPr>
+        <w:t xml:space="preserve">intimação do autor para regularizar a representação, sob pena de extinção</w:t>
+      </w:r>
+      <w:r>
+        <w:t xml:space="preserve"> </w:t>
+      </w:r>
+      <w:r>
+        <w:t xml:space="preserve">(arts. 76, § 1º, I, e 485, IV, do CPC), com a declaração de</w:t>
+      </w:r>
+      <w:r>
+        <w:t xml:space="preserve"> </w:t>
+      </w:r>
+      <w:r>
+        <w:rPr>
+          <w:bCs/>
+          <w:b/>
+        </w:rPr>
+        <w:t xml:space="preserve">ineficácia dos atos praticados sem mandato</w:t>
+      </w:r>
+      <w:r>
+        <w:t xml:space="preserve"> </w:t>
+      </w:r>
+      <w:r>
+        <w:t xml:space="preserve">não ratificados, inclusive a petição de ID 107306168 (art. 104, § 2º, do CPC);</w:t>
+      </w:r>
+    </w:p>
+    <w:p>
+      <w:pPr>
+        <w:pStyle w:val="BlockText"/>
+      </w:pPr>
+      <w:r>
+        <w:rPr>
+          <w:bCs/>
+          <w:b/>
+        </w:rPr>
+        <w:t xml:space="preserve">4)</w:t>
+      </w:r>
+      <w:r>
+        <w:t xml:space="preserve"> </w:t>
+      </w:r>
+      <w:r>
         <w:t xml:space="preserve">subsidiariamente, caso Vossa Excelência não acolha a extinção, o registro da ausência do autor e o regular prosseguimento do feito, com o</w:t>
       </w:r>
       <w:r>
@@ -781,7 +989,7 @@
         <w:t xml:space="preserve">não foi revogada</w:t>
       </w:r>
       <w:r>
-        <w:t xml:space="preserve">. O desinteresse unilateral não autoriza a parte a descumprir a determinação do Juízo. No rito da Lei 9.099, não há cancelamento automático da audiência por manifestação das partes (TJPR, RI 0002883-64.2024.8.16.0160). Se o autor entendia que o ato não deveria ocorrer, cabia-lhe aguardar a decisão do Juízo e, mantido o ato, comparecer, o que ele mesmo previu no item 4 da sua petição, mas apenas por meio do advogado. Reitera-se o pedido de extinção.</w:t>
+        <w:t xml:space="preserve">. O desinteresse unilateral não autoriza a parte a descumprir a determinação do Juízo. No rito da Lei 9.099, não há cancelamento automático da audiência por manifestação das partes (TJPR, RI 0002883-64.2024.8.16.0160). Foi o próprio autor quem optou pelo rito da Lei 9.099 e pediu os seus benefícios (inicial, item II e pedido 5); não pode agora invocar o CPC para fugir da audiência que esse rito impõe. Se o autor entendia que o ato não deveria ocorrer, cabia-lhe aguardar a decisão do Juízo e, mantido o ato, comparecer, o que ele mesmo previu no item 4 da sua petição, mas apenas por meio do advogado. Reitera-se o pedido de extinção.</w:t>
       </w:r>
       <w:r>
         <w:t xml:space="preserve">”</w:t>
@@ -892,7 +1100,20 @@
         <w:t xml:space="preserve"> </w:t>
       </w:r>
       <w:r>
-        <w:t xml:space="preserve">(TJPR, 3ª TR, Processo 0008989-29.2024.8.16.0035, j. 23/03/2026). O próprio autor se beneficiou do rito ao ajuizar sem custas (art. 54 da Lei 9.099/95); não pode agora afastá-lo para fugir da consequência da sua ausência.</w:t>
+        <w:t xml:space="preserve">(TJPR, 3ª TR, Processo 0008989-29.2024.8.16.0035, j. 23/03/2026). Além disso,</w:t>
+      </w:r>
+      <w:r>
+        <w:t xml:space="preserve"> </w:t>
+      </w:r>
+      <w:r>
+        <w:rPr>
+          <w:bCs/>
+          <w:b/>
+        </w:rPr>
+        <w:t xml:space="preserve">não há procuração do autor nos autos</w:t>
+      </w:r>
+      <w:r>
+        <w:t xml:space="preserve">: o advogado não tem sequer mandato, quanto mais poderes especiais para transigir, que nos Juizados não podem ser verbais (art. 9º, § 3º, da Lei 9.099/95). O próprio autor escolheu o rito e se beneficiou dele ao ajuizar sem custas (art. 54 da Lei 9.099/95); não pode agora afastá-lo para fugir da consequência da sua ausência.</w:t>
       </w:r>
       <w:r>
         <w:t xml:space="preserve">”</w:t>
@@ -973,7 +1194,35 @@
         <w:t xml:space="preserve">deliberada e anunciada</w:t>
       </w:r>
       <w:r>
-        <w:t xml:space="preserve">: o autor declarou nos autos que não quer transigir, de modo que o advogado comparece com a ordem do próprio mandante de não compor. Quem frustrou a finalidade do ato foi o autor, não o réu, que está presente pessoalmente. Segundo, a causa versa sobre</w:t>
+        <w:t xml:space="preserve">: o autor declarou nos autos que não quer transigir, de modo que o advogado comparece com a ordem do próprio mandante de não compor. Quem frustrou a finalidade do ato foi o autor, não o réu, que está presente pessoalmente. Segundo, aquele precedente pressupõe advogado</w:t>
+      </w:r>
+      <w:r>
+        <w:t xml:space="preserve"> </w:t>
+      </w:r>
+      <w:r>
+        <w:t xml:space="preserve">‘</w:t>
+      </w:r>
+      <w:r>
+        <w:t xml:space="preserve">com amplos poderes para transigir</w:t>
+      </w:r>
+      <w:r>
+        <w:t xml:space="preserve">’</w:t>
+      </w:r>
+      <w:r>
+        <w:t xml:space="preserve">; aqui</w:t>
+      </w:r>
+      <w:r>
+        <w:t xml:space="preserve"> </w:t>
+      </w:r>
+      <w:r>
+        <w:rPr>
+          <w:bCs/>
+          <w:b/>
+        </w:rPr>
+        <w:t xml:space="preserve">não há sequer procuração nos autos</w:t>
+      </w:r>
+      <w:r>
+        <w:t xml:space="preserve">, e poderes para transigir não podem ser verbais nos Juizados (art. 9º, § 3º). Terceiro, a causa versa sobre</w:t>
       </w:r>
       <w:r>
         <w:t xml:space="preserve"> </w:t>
@@ -986,7 +1235,7 @@
         <w:t xml:space="preserve">honra e retratação pessoal</w:t>
       </w:r>
       <w:r>
-        <w:t xml:space="preserve">, matéria personalíssima em que a presença das partes é essencial a qualquer composição. Terceiro, a audiência nos Juizados não serve apenas à proposta de acordo: tem</w:t>
+        <w:t xml:space="preserve">, matéria personalíssima em que a presença das partes é essencial a qualquer composição. Quarto, a audiência nos Juizados não serve apenas à proposta de acordo: tem</w:t>
       </w:r>
       <w:r>
         <w:t xml:space="preserve"> </w:t>
@@ -1328,6 +1577,42 @@
       </w:r>
       <w:r>
         <w:t xml:space="preserve">, requerendo que conste em ata.</w:t>
+      </w:r>
+    </w:p>
+    <w:p>
+      <w:pPr>
+        <w:pStyle w:val="BlockText"/>
+      </w:pPr>
+      <w:r>
+        <w:t xml:space="preserve">Registra, ainda, a</w:t>
+      </w:r>
+      <w:r>
+        <w:t xml:space="preserve"> </w:t>
+      </w:r>
+      <w:r>
+        <w:rPr>
+          <w:bCs/>
+          <w:b/>
+        </w:rPr>
+        <w:t xml:space="preserve">ausência de procuração do autor nos autos</w:t>
+      </w:r>
+      <w:r>
+        <w:t xml:space="preserve">, embora a inicial afirme</w:t>
+      </w:r>
+      <w:r>
+        <w:t xml:space="preserve"> </w:t>
+      </w:r>
+      <w:r>
+        <w:t xml:space="preserve">“</w:t>
+      </w:r>
+      <w:r>
+        <w:t xml:space="preserve">procuração em anexo</w:t>
+      </w:r>
+      <w:r>
+        <w:t xml:space="preserve">”</w:t>
+      </w:r>
+      <w:r>
+        <w:t xml:space="preserve">, e requer a intimação do autor para regularizar a representação, sob pena de extinção (arts. 76, § 1º, I, e 485, IV, do CPC; art. 104, § 2º, do CPC).</w:t>
       </w:r>
     </w:p>
     <w:p>
@@ -1917,6 +2202,32 @@
               <w:jc w:val="left"/>
             </w:pPr>
             <w:r>
+              <w:t xml:space="preserve">Procuração ausente</w:t>
+            </w:r>
+          </w:p>
+        </w:tc>
+        <w:tc>
+          <w:tcPr/>
+          <w:p>
+            <w:pPr>
+              <w:pStyle w:val="Compact"/>
+              <w:jc w:val="left"/>
+            </w:pPr>
+            <w:r>
+              <w:t xml:space="preserve">Lei 9.099/95, art. 9º, § 3º (poderes especiais não podem ser verbais); CPC arts. 76 § 1º I, 104 § 2º, 105, 485 IV</w:t>
+            </w:r>
+          </w:p>
+        </w:tc>
+      </w:tr>
+      <w:tr>
+        <w:tc>
+          <w:tcPr/>
+          <w:p>
+            <w:pPr>
+              <w:pStyle w:val="Compact"/>
+              <w:jc w:val="left"/>
+            </w:pPr>
+            <w:r>
               <w:t xml:space="preserve">Normas</w:t>
             </w:r>
           </w:p>
@@ -1929,7 +2240,7 @@
               <w:jc w:val="left"/>
             </w:pPr>
             <w:r>
-              <w:t xml:space="preserve">Lei 9.099/95, arts. 2º, 9º § 4º, 20, 21, 22, 30, 51 I e §§ 1º e 2º, 54; FONAJE 10, 11, 13, 20, 28; CPC arts. 5º, 6º, 223, 231, 355 I, 486 § 2º</w:t>
+              <w:t xml:space="preserve">Lei 9.099/95, arts. 2º, 9º §§ 3º e 4º, 20, 21, 22, 30, 51 I e §§ 1º e 2º, 54; FONAJE 10, 11, 13, 20, 28; CPC arts. 5º, 6º, 223, 231, 355 I, 486 § 2º</w:t>
             </w:r>
           </w:p>
         </w:tc>

</xml_diff>

<commit_message>
Pedido oral: resposta ao pedido de prazo para juntar procuração (art. 104 CPC)
Co-Authored-By: Claude Opus 5.5 <noreply@anthropic.com>
Claude-Session: https://claude.ai/code/session_01CUmiv8ZKDC5VxLQ3BigcLo
</commit_message>
<xml_diff>
--- a/0800990-83.2026 - Ely Sandro/Pedido oral - audiência de conciliação 22-10-2026.docx
+++ b/0800990-83.2026 - Ely Sandro/Pedido oral - audiência de conciliação 22-10-2026.docx
@@ -1471,6 +1471,124 @@
       </w:r>
       <w:r>
         <w:t xml:space="preserve">”</w:t>
+      </w:r>
+    </w:p>
+    <w:p>
+      <w:pPr>
+        <w:pStyle w:val="FirstParagraph"/>
+      </w:pPr>
+      <w:r>
+        <w:rPr>
+          <w:bCs/>
+          <w:b/>
+        </w:rPr>
+        <w:t xml:space="preserve">7. O advogado do autor pede prazo de 15 dias para juntar a procuração (art. 104 do CPC):</w:t>
+      </w:r>
+    </w:p>
+    <w:p>
+      <w:pPr>
+        <w:pStyle w:val="BlockText"/>
+      </w:pPr>
+      <w:r>
+        <w:t xml:space="preserve">“Excelência, duas observações. Primeiro, o prazo do art. 104, § 1º, do CPC é de 15 dias</w:t>
+      </w:r>
+      <w:r>
+        <w:t xml:space="preserve"> </w:t>
+      </w:r>
+      <w:r>
+        <w:rPr>
+          <w:bCs/>
+          <w:b/>
+        </w:rPr>
+        <w:t xml:space="preserve">contados do ato praticado sem mandato</w:t>
+      </w:r>
+      <w:r>
+        <w:t xml:space="preserve">, prorrogável uma vez por despacho. A inicial foi protocolada em 08/07/2026, há mais de três meses, sem procuração e sem pedido de prorrogação: o prazo legal</w:t>
+      </w:r>
+      <w:r>
+        <w:t xml:space="preserve"> </w:t>
+      </w:r>
+      <w:r>
+        <w:rPr>
+          <w:bCs/>
+          <w:b/>
+        </w:rPr>
+        <w:t xml:space="preserve">já se esgotou</w:t>
+      </w:r>
+      <w:r>
+        <w:t xml:space="preserve">, e os atos não ratificados são ineficazes (art. 104, § 2º). Caso Vossa Excelência entenda por conceder novo prazo (art. 76 do CPC), requer que seja</w:t>
+      </w:r>
+      <w:r>
+        <w:t xml:space="preserve"> </w:t>
+      </w:r>
+      <w:r>
+        <w:rPr>
+          <w:bCs/>
+          <w:b/>
+        </w:rPr>
+        <w:t xml:space="preserve">improrrogável</w:t>
+      </w:r>
+      <w:r>
+        <w:t xml:space="preserve"> </w:t>
+      </w:r>
+      <w:r>
+        <w:t xml:space="preserve">e</w:t>
+      </w:r>
+      <w:r>
+        <w:t xml:space="preserve"> </w:t>
+      </w:r>
+      <w:r>
+        <w:rPr>
+          <w:bCs/>
+          <w:b/>
+        </w:rPr>
+        <w:t xml:space="preserve">sob pena de extinção</w:t>
+      </w:r>
+      <w:r>
+        <w:t xml:space="preserve"> </w:t>
+      </w:r>
+      <w:r>
+        <w:t xml:space="preserve">(art. 76, § 1º, I, e art. 485, IV).</w:t>
+      </w:r>
+    </w:p>
+    <w:p>
+      <w:pPr>
+        <w:pStyle w:val="BlockText"/>
+      </w:pPr>
+      <w:r>
+        <w:t xml:space="preserve">Segundo, e principalmente: a regularização da procuração</w:t>
+      </w:r>
+      <w:r>
+        <w:t xml:space="preserve"> </w:t>
+      </w:r>
+      <w:r>
+        <w:rPr>
+          <w:bCs/>
+          <w:b/>
+        </w:rPr>
+        <w:t xml:space="preserve">não supre a ausência pessoal do autor</w:t>
+      </w:r>
+      <w:r>
+        <w:t xml:space="preserve"> </w:t>
+      </w:r>
+      <w:r>
+        <w:t xml:space="preserve">a esta audiência. São questões independentes. Ainda que juntada procuração com poderes para transigir, nos Juizados a presença do advogado não substitui a da parte (Enunciado 20 do FONAJE; TJPI, RI 0000116-41.2012.8.18.0088; TJPR, Proc. 0008989-29.2024.8.16.0035). A extinção pelo art. 51, I, decorre do fato já ocorrido hoje e</w:t>
+      </w:r>
+      <w:r>
+        <w:t xml:space="preserve"> </w:t>
+      </w:r>
+      <w:r>
+        <w:rPr>
+          <w:bCs/>
+          <w:b/>
+        </w:rPr>
+        <w:t xml:space="preserve">não depende</w:t>
+      </w:r>
+      <w:r>
+        <w:t xml:space="preserve"> </w:t>
+      </w:r>
+      <w:r>
+        <w:t xml:space="preserve">da regularização. Reitera-se, assim, o pedido de extinção, sem prejuízo do prazo eventualmente concedido.”</w:t>
       </w:r>
     </w:p>
     <w:bookmarkEnd w:id="21"/>

</xml_diff>

<commit_message>
Pedido oral: Cenário C (cancelamento da audiência)
Co-Authored-By: Claude Opus 5.5 <noreply@anthropic.com>
Claude-Session: https://claude.ai/code/session_01CUmiv8ZKDC5VxLQ3BigcLo
</commit_message>
<xml_diff>
--- a/0800990-83.2026 - Ely Sandro/Pedido oral - audiência de conciliação 22-10-2026.docx
+++ b/0800990-83.2026 - Ely Sandro/Pedido oral - audiência de conciliação 22-10-2026.docx
@@ -2,7 +2,7 @@
 <file path=word/document.xml><?xml version="1.0" encoding="utf-8"?>
 <w:document xmlns:w="http://schemas.openxmlformats.org/wordprocessingml/2006/main" xmlns:m="http://schemas.openxmlformats.org/officeDocument/2006/math" xmlns:r="http://schemas.openxmlformats.org/officeDocument/2006/relationships" xmlns:o="urn:schemas-microsoft-com:office:office" xmlns:v="urn:schemas-microsoft-com:vml" xmlns:w10="urn:schemas-microsoft-com:office:word" xmlns:a="http://schemas.openxmlformats.org/drawingml/2006/main" xmlns:pic="http://schemas.openxmlformats.org/drawingml/2006/picture" xmlns:wp="http://schemas.openxmlformats.org/drawingml/2006/wordprocessingDrawing">
   <w:body>
-    <w:bookmarkStart w:id="27" w:name="Xa28dfabad047e90ef0866cbad0bdd7a86ecae39"/>
+    <w:bookmarkStart w:id="30" w:name="Xa28dfabad047e90ef0866cbad0bdd7a86ecae39"/>
     <w:p>
       <w:pPr>
         <w:pStyle w:val="Heading1"/>
@@ -109,7 +109,20 @@
         <w:t xml:space="preserve"> </w:t>
       </w:r>
       <w:r>
-        <w:t xml:space="preserve">a audiência. Se a audiência for cancelada pelo juízo antes do ato, a tese de extinção cai (TJPR distingue exatamente esse caso).</w:t>
+        <w:t xml:space="preserve">a audiência. Se saiu, ir direto ao</w:t>
+      </w:r>
+      <w:r>
+        <w:t xml:space="preserve"> </w:t>
+      </w:r>
+      <w:r>
+        <w:rPr>
+          <w:bCs/>
+          <w:b/>
+        </w:rPr>
+        <w:t xml:space="preserve">Cenário C2</w:t>
+      </w:r>
+      <w:r>
+        <w:t xml:space="preserve">.</w:t>
       </w:r>
     </w:p>
     <w:p>
@@ -1798,13 +1811,30 @@
       </w:r>
     </w:p>
     <w:bookmarkEnd w:id="23"/>
-    <w:bookmarkStart w:id="24" w:name="X6ddbc57cd36f29febb9415e2785fb01386765c4"/>
+    <w:bookmarkStart w:id="26" w:name="cenário-c-o-juiz-cancela-a-audiência"/>
     <w:p>
       <w:pPr>
         <w:pStyle w:val="Heading2"/>
       </w:pPr>
       <w:r>
-        <w:t xml:space="preserve">Se o autor alegar intempestividade da contestação (qualquer cenário)</w:t>
+        <w:t xml:space="preserve">CENÁRIO C — O juiz cancela a audiência</w:t>
+      </w:r>
+    </w:p>
+    <w:bookmarkStart w:id="24" w:name="X63fbb778c53f124e5e080ce3f94fa6c2e8d6bf4"/>
+    <w:p>
+      <w:pPr>
+        <w:pStyle w:val="Heading3"/>
+      </w:pPr>
+      <w:r>
+        <w:t xml:space="preserve">C1. Cancelamento na abertura do ato (sala já aberta)</w:t>
+      </w:r>
+    </w:p>
+    <w:p>
+      <w:pPr>
+        <w:pStyle w:val="FirstParagraph"/>
+      </w:pPr>
+      <w:r>
+        <w:t xml:space="preserve">Antes de qualquer deliberação, pedir o registro dos fatos. Eles servem de base para o recurso inominado futuro.</w:t>
       </w:r>
     </w:p>
     <w:p>
@@ -1812,147 +1842,107 @@
         <w:pStyle w:val="BlockText"/>
       </w:pPr>
       <w:r>
-        <w:t xml:space="preserve">“Excelência, a questão está superada. A audiência foi designada</w:t>
-      </w:r>
-      <w:r>
-        <w:t xml:space="preserve"> </w:t>
-      </w:r>
-      <w:r>
-        <w:rPr>
-          <w:bCs/>
-          <w:b/>
-        </w:rPr>
-        <w:t xml:space="preserve">a partir do requerimento formulado na própria contestação</w:t>
-      </w:r>
-      <w:r>
-        <w:t xml:space="preserve"> </w:t>
-      </w:r>
-      <w:r>
-        <w:t xml:space="preserve">(ID 106243575), sem certidão de decurso de prazo ou de intempestividade: o Juízo recebeu a defesa e lhe deu seguimento. Além disso, no rito da Lei 9.099/1995, a revelia decorre do</w:t>
-      </w:r>
-      <w:r>
-        <w:t xml:space="preserve"> </w:t>
-      </w:r>
-      <w:r>
-        <w:rPr>
-          <w:bCs/>
-          <w:b/>
-        </w:rPr>
-        <w:t xml:space="preserve">não comparecimento do réu</w:t>
-      </w:r>
-      <w:r>
-        <w:t xml:space="preserve"> </w:t>
-      </w:r>
-      <w:r>
-        <w:t xml:space="preserve">(art. 20) ou, nas causas superiores a vinte salários mínimos, da</w:t>
-      </w:r>
-      <w:r>
-        <w:t xml:space="preserve"> </w:t>
-      </w:r>
-      <w:r>
-        <w:rPr>
-          <w:bCs/>
-          <w:b/>
-        </w:rPr>
-        <w:t xml:space="preserve">ausência de contestação</w:t>
-      </w:r>
-      <w:r>
-        <w:t xml:space="preserve"> </w:t>
-      </w:r>
-      <w:r>
-        <w:t xml:space="preserve">(Enunciado 11 do FONAJE), que é apresentada</w:t>
-      </w:r>
-      <w:r>
-        <w:t xml:space="preserve"> </w:t>
-      </w:r>
-      <w:r>
-        <w:rPr>
-          <w:bCs/>
-          <w:b/>
-        </w:rPr>
-        <w:t xml:space="preserve">na audiência</w:t>
-      </w:r>
-      <w:r>
-        <w:t xml:space="preserve"> </w:t>
-      </w:r>
-      <w:r>
-        <w:t xml:space="preserve">(art. 30) e, nos termos do</w:t>
-      </w:r>
-      <w:r>
-        <w:t xml:space="preserve"> </w:t>
-      </w:r>
-      <w:r>
-        <w:rPr>
-          <w:bCs/>
-          <w:b/>
-        </w:rPr>
-        <w:t xml:space="preserve">Enunciado 10 do FONAJE</w:t>
-      </w:r>
-      <w:r>
-        <w:t xml:space="preserve">,</w:t>
-      </w:r>
-      <w:r>
-        <w:t xml:space="preserve"> </w:t>
-      </w:r>
-      <w:r>
-        <w:t xml:space="preserve">‘</w:t>
-      </w:r>
-      <w:r>
-        <w:rPr>
-          <w:bCs/>
-          <w:b/>
-        </w:rPr>
-        <w:t xml:space="preserve">a contestação poderá ser apresentada até a audiência de Instrução e Julgamento</w:t>
-      </w:r>
-      <w:r>
-        <w:t xml:space="preserve">’</w:t>
-      </w:r>
-      <w:r>
-        <w:t xml:space="preserve">. Nenhuma das hipóteses ocorre. Ad cautelam, o requerido</w:t>
-      </w:r>
-      <w:r>
-        <w:t xml:space="preserve"> </w:t>
-      </w:r>
-      <w:r>
-        <w:rPr>
-          <w:bCs/>
-          <w:b/>
-        </w:rPr>
-        <w:t xml:space="preserve">ratifica neste ato a contestação de ID 106243575 e os documentos que a instruem</w:t>
-      </w:r>
-      <w:r>
-        <w:t xml:space="preserve">, requerendo que conste em ata.</w:t>
-      </w:r>
-    </w:p>
-    <w:p>
-      <w:pPr>
-        <w:pStyle w:val="BlockText"/>
-      </w:pPr>
-      <w:r>
-        <w:t xml:space="preserve">Por isso, a discussão sobre o termo inicial do prazo, inclusive à luz do Enunciado 13 do FONAJE, é</w:t>
-      </w:r>
-      <w:r>
-        <w:t xml:space="preserve"> </w:t>
-      </w:r>
-      <w:r>
-        <w:rPr>
-          <w:bCs/>
-          <w:b/>
-        </w:rPr>
-        <w:t xml:space="preserve">irrelevante</w:t>
-      </w:r>
-      <w:r>
-        <w:t xml:space="preserve">: ainda que se conte da ciência da citação, a defesa pode ser apresentada até a audiência de instrução, que sequer foi designada. De todo modo, a decisão de ID 100909958 fixou expressamente o art. 231 do CPC como termo inicial. O próprio prazo de 15 dias para contestação escrita não existe na Lei 9.099; é criação do CPC (art. 335) adotada pelo Juízo, e por isso o seu termo inicial segue o sistema do CPC que o Juízo expressamente indicou. Um comando judicial específico, dirigido à parte, prevalece sobre orientação genérica de enunciado. A defesa observou esse marco, em atenção à boa-fé e à proteção da confiança (arts. 5º e 6º do CPC), e, subsidiariamente, há justa causa (art. 223, §§ 1º e 2º, do CPC).”</w:t>
+        <w:t xml:space="preserve">“</w:t>
+      </w:r>
+      <w:r>
+        <w:t xml:space="preserve">Excelência, antes da deliberação, a defesa requer que conste em ata: (i) que o</w:t>
+      </w:r>
+      <w:r>
+        <w:t xml:space="preserve"> </w:t>
+      </w:r>
+      <w:r>
+        <w:rPr>
+          <w:bCs/>
+          <w:b/>
+        </w:rPr>
+        <w:t xml:space="preserve">requerido compareceu pessoalmente</w:t>
+      </w:r>
+      <w:r>
+        <w:t xml:space="preserve"> </w:t>
+      </w:r>
+      <w:r>
+        <w:t xml:space="preserve">e o</w:t>
+      </w:r>
+      <w:r>
+        <w:t xml:space="preserve"> </w:t>
+      </w:r>
+      <w:r>
+        <w:rPr>
+          <w:bCs/>
+          <w:b/>
+        </w:rPr>
+        <w:t xml:space="preserve">autor não compareceu</w:t>
+      </w:r>
+      <w:r>
+        <w:t xml:space="preserve">; (ii) que</w:t>
+      </w:r>
+      <w:r>
+        <w:t xml:space="preserve"> </w:t>
+      </w:r>
+      <w:r>
+        <w:rPr>
+          <w:bCs/>
+          <w:b/>
+        </w:rPr>
+        <w:t xml:space="preserve">não há procuração do autor nos autos</w:t>
+      </w:r>
+      <w:r>
+        <w:t xml:space="preserve">; e (iii) a</w:t>
+      </w:r>
+      <w:r>
+        <w:t xml:space="preserve"> </w:t>
+      </w:r>
+      <w:r>
+        <w:rPr>
+          <w:bCs/>
+          <w:b/>
+        </w:rPr>
+        <w:t xml:space="preserve">oposição do requerido ao cancelamento</w:t>
+      </w:r>
+      <w:r>
+        <w:t xml:space="preserve">. O requerido manifestou interesse na conciliação (contestação, ID 106243575). Nem pelo CPC a audiência poderia ser dispensada, pois o art. 334, § 4º, I, exige que</w:t>
+      </w:r>
+      <w:r>
+        <w:t xml:space="preserve"> </w:t>
+      </w:r>
+      <w:r>
+        <w:rPr>
+          <w:bCs/>
+          <w:b/>
+        </w:rPr>
+        <w:t xml:space="preserve">ambas</w:t>
+      </w:r>
+      <w:r>
+        <w:t xml:space="preserve"> </w:t>
+      </w:r>
+      <w:r>
+        <w:t xml:space="preserve">as partes manifestem desinteresse. E, no rito da Lei 9.099/1995, escolhido pelo próprio autor, não existe cancelamento por manifestação das partes (TJPR, RI 0002883-64.2024.8.16.0160). Além disso, o pedido de cancelamento (ID 107306168) foi formulado por advogado</w:t>
+      </w:r>
+      <w:r>
+        <w:t xml:space="preserve"> </w:t>
+      </w:r>
+      <w:r>
+        <w:rPr>
+          <w:bCs/>
+          <w:b/>
+        </w:rPr>
+        <w:t xml:space="preserve">sem procuração nos autos</w:t>
+      </w:r>
+      <w:r>
+        <w:t xml:space="preserve">, sendo ato ineficaz enquanto não ratificado (art. 104, § 2º, do CPC). Requer, assim, a manutenção do ato e a extinção do processo (art. 51, I). Mantida a deliberação, requer o registro do protesto, para oportuna arguição em recurso.</w:t>
+      </w:r>
+      <w:r>
+        <w:t xml:space="preserve">”</w:t>
       </w:r>
     </w:p>
     <w:bookmarkEnd w:id="24"/>
-    <w:bookmarkStart w:id="25" w:name="cuidados-durante-o-ato"/>
-    <w:p>
-      <w:pPr>
-        <w:pStyle w:val="Heading2"/>
-      </w:pPr>
-      <w:r>
-        <w:t xml:space="preserve">Cuidados durante o ato</w:t>
+    <w:bookmarkStart w:id="25" w:name="Xd4b66d3cd696afd1f17f667564c1aa01ce6012a"/>
+    <w:p>
+      <w:pPr>
+        <w:pStyle w:val="Heading3"/>
+      </w:pPr>
+      <w:r>
+        <w:t xml:space="preserve">C2. Cancelamento por despacho antes do ato</w:t>
       </w:r>
     </w:p>
     <w:p>
@@ -1964,17 +1954,20 @@
         <w:pStyle w:val="Compact"/>
       </w:pPr>
       <w:r>
-        <w:rPr>
-          <w:bCs/>
-          <w:b/>
-        </w:rPr>
-        <w:t xml:space="preserve">Em qualquer cenário em que o processo prossiga, ratificar a contestação em ata.</w:t>
-      </w:r>
-      <w:r>
-        <w:t xml:space="preserve"> </w:t>
-      </w:r>
-      <w:r>
-        <w:t xml:space="preserve">Valor da causa (R$ 60.000,00) supera 20 salários mínimos: pelo Enunciado 11 do FONAJE, a revelia aqui depende da ausência de contestação; a ratificação resolve também o risco do Enunciado 13.</w:t>
+        <w:t xml:space="preserve">A tese do art. 51, I,</w:t>
+      </w:r>
+      <w:r>
+        <w:t xml:space="preserve"> </w:t>
+      </w:r>
+      <w:r>
+        <w:rPr>
+          <w:bCs/>
+          <w:b/>
+        </w:rPr>
+        <w:t xml:space="preserve">deixa de existir</w:t>
+      </w:r>
+      <w:r>
+        <w:t xml:space="preserve">: sem audiência, não há ausência. O TJPR distingue exatamente o caso de audiência cancelada pelo juízo.</w:t>
       </w:r>
     </w:p>
     <w:p>
@@ -1986,29 +1979,23 @@
         <w:pStyle w:val="Compact"/>
       </w:pPr>
       <w:r>
-        <w:rPr>
-          <w:bCs/>
-          <w:b/>
-        </w:rPr>
-        <w:t xml:space="preserve">Não aceitar proposta de retratação genérica</w:t>
-      </w:r>
-      <w:r>
-        <w:t xml:space="preserve"> </w:t>
-      </w:r>
-      <w:r>
-        <w:t xml:space="preserve">(</w:t>
-      </w:r>
-      <w:r>
-        <w:t xml:space="preserve">“</w:t>
-      </w:r>
-      <w:r>
-        <w:t xml:space="preserve">reconhecer a inveracidade das imputações</w:t>
-      </w:r>
-      <w:r>
-        <w:t xml:space="preserve">”</w:t>
-      </w:r>
-      <w:r>
-        <w:t xml:space="preserve">). Se houver proposta, pedir prazo para consultar o cliente e que conste em ata.</w:t>
+        <w:t xml:space="preserve">Não há agravo nos Juizados (Enunciado 15 do FONAJE). As interlocutórias não precluem e podem ser impugnadas</w:t>
+      </w:r>
+      <w:r>
+        <w:t xml:space="preserve"> </w:t>
+      </w:r>
+      <w:r>
+        <w:rPr>
+          <w:bCs/>
+          <w:b/>
+        </w:rPr>
+        <w:t xml:space="preserve">em preliminar de recurso inominado</w:t>
+      </w:r>
+      <w:r>
+        <w:t xml:space="preserve"> </w:t>
+      </w:r>
+      <w:r>
+        <w:t xml:space="preserve">contra a sentença. Por isso, registrar já a oposição.</w:t>
       </w:r>
     </w:p>
     <w:p>
@@ -2024,38 +2011,293 @@
           <w:bCs/>
           <w:b/>
         </w:rPr>
-        <w:t xml:space="preserve">Opcional, a critério do cliente:</w:t>
-      </w:r>
-      <w:r>
-        <w:t xml:space="preserve"> </w:t>
-      </w:r>
-      <w:r>
-        <w:t xml:space="preserve">levar uma posição mínima, não confessional (ex.: reconhecer o fato já admitido na contestação, de que o inquérito foi arquivado com reconhecimento da origem lícita do numerário), para esvaziar a tese de que a audiência seria</w:t>
-      </w:r>
-      <w:r>
-        <w:t xml:space="preserve"> </w:t>
-      </w:r>
-      <w:r>
-        <w:t xml:space="preserve">“</w:t>
-      </w:r>
-      <w:r>
-        <w:t xml:space="preserve">pro forma</w:t>
-      </w:r>
-      <w:r>
-        <w:t xml:space="preserve">”</w:t>
-      </w:r>
-      <w:r>
-        <w:t xml:space="preserve"> </w:t>
-      </w:r>
-      <w:r>
-        <w:t xml:space="preserve">sem proposta concreta. Não é retratação.</w:t>
+        <w:t xml:space="preserve">Protocolar petição</w:t>
+      </w:r>
+      <w:r>
+        <w:t xml:space="preserve"> </w:t>
+      </w:r>
+      <w:r>
+        <w:t xml:space="preserve">com:</w:t>
+      </w:r>
+    </w:p>
+    <w:p>
+      <w:pPr>
+        <w:numPr>
+          <w:ilvl w:val="1"/>
+          <w:numId w:val="1002"/>
+        </w:numPr>
+        <w:pStyle w:val="Compact"/>
+      </w:pPr>
+      <w:r>
+        <w:rPr>
+          <w:bCs/>
+          <w:b/>
+        </w:rPr>
+        <w:t xml:space="preserve">Oposição ao cancelamento</w:t>
+      </w:r>
+      <w:r>
+        <w:t xml:space="preserve">, para registro: o art. 334, § 4º, I, do CPC exige desinteresse de</w:t>
+      </w:r>
+      <w:r>
+        <w:t xml:space="preserve"> </w:t>
+      </w:r>
+      <w:r>
+        <w:rPr>
+          <w:bCs/>
+          <w:b/>
+        </w:rPr>
+        <w:t xml:space="preserve">ambas</w:t>
+      </w:r>
+      <w:r>
+        <w:t xml:space="preserve"> </w:t>
+      </w:r>
+      <w:r>
+        <w:t xml:space="preserve">as partes; o rito da Lei 9.099 foi escolhido pelo autor (inicial, item II e pedido 5); o pedido de cancelamento foi feito sem procuração (art. 104, § 2º, do CPC).</w:t>
+      </w:r>
+    </w:p>
+    <w:p>
+      <w:pPr>
+        <w:numPr>
+          <w:ilvl w:val="1"/>
+          <w:numId w:val="1002"/>
+        </w:numPr>
+        <w:pStyle w:val="Compact"/>
+      </w:pPr>
+      <w:r>
+        <w:rPr>
+          <w:bCs/>
+          <w:b/>
+        </w:rPr>
+        <w:t xml:space="preserve">Irregularidade de representação:</w:t>
+      </w:r>
+      <w:r>
+        <w:t xml:space="preserve"> </w:t>
+      </w:r>
+      <w:r>
+        <w:t xml:space="preserve">intimação do autor para juntar procuração em prazo</w:t>
+      </w:r>
+      <w:r>
+        <w:t xml:space="preserve"> </w:t>
+      </w:r>
+      <w:r>
+        <w:rPr>
+          <w:bCs/>
+          <w:b/>
+        </w:rPr>
+        <w:t xml:space="preserve">improrrogável</w:t>
+      </w:r>
+      <w:r>
+        <w:t xml:space="preserve">, sob pena de extinção (arts. 76, § 1º, I, e 485, IV, do CPC), com a ineficácia dos atos não ratificados, inclusive o pedido de cancelamento e a própria inicial (art. 104, § 2º).</w:t>
+      </w:r>
+    </w:p>
+    <w:p>
+      <w:pPr>
+        <w:numPr>
+          <w:ilvl w:val="1"/>
+          <w:numId w:val="1002"/>
+        </w:numPr>
+        <w:pStyle w:val="Compact"/>
+      </w:pPr>
+      <w:r>
+        <w:rPr>
+          <w:bCs/>
+          <w:b/>
+        </w:rPr>
+        <w:t xml:space="preserve">Ratificação da contestação</w:t>
+      </w:r>
+      <w:r>
+        <w:t xml:space="preserve"> </w:t>
+      </w:r>
+      <w:r>
+        <w:t xml:space="preserve">(ID 106243575) e defesa da tempestividade (Enunciados 10 e 11 do FONAJE; art. 231 do CPC fixado pelo juízo; boa-fé, arts. 5º e 6º; justa causa, art. 223), antecipando o ataque que o autor anunciou para a réplica.</w:t>
+      </w:r>
+    </w:p>
+    <w:p>
+      <w:pPr>
+        <w:numPr>
+          <w:ilvl w:val="1"/>
+          <w:numId w:val="1002"/>
+        </w:numPr>
+        <w:pStyle w:val="Compact"/>
+      </w:pPr>
+      <w:r>
+        <w:rPr>
+          <w:bCs/>
+          <w:b/>
+        </w:rPr>
+        <w:t xml:space="preserve">Julgamento antecipado do mérito</w:t>
+      </w:r>
+      <w:r>
+        <w:t xml:space="preserve"> </w:t>
+      </w:r>
+      <w:r>
+        <w:t xml:space="preserve">(art. 355, I, do CPC), pela imunidade parlamentar material (art. 29, VIII, CF; Tema 469/STF), já reconhecida na decisão de ID 100909958.</w:t>
+      </w:r>
+    </w:p>
+    <w:bookmarkEnd w:id="25"/>
+    <w:bookmarkEnd w:id="26"/>
+    <w:bookmarkStart w:id="27" w:name="X6ddbc57cd36f29febb9415e2785fb01386765c4"/>
+    <w:p>
+      <w:pPr>
+        <w:pStyle w:val="Heading2"/>
+      </w:pPr>
+      <w:r>
+        <w:t xml:space="preserve">Se o autor alegar intempestividade da contestação (qualquer cenário)</w:t>
+      </w:r>
+    </w:p>
+    <w:p>
+      <w:pPr>
+        <w:pStyle w:val="BlockText"/>
+      </w:pPr>
+      <w:r>
+        <w:t xml:space="preserve">“Excelência, a questão está superada. A audiência foi designada</w:t>
+      </w:r>
+      <w:r>
+        <w:t xml:space="preserve"> </w:t>
+      </w:r>
+      <w:r>
+        <w:rPr>
+          <w:bCs/>
+          <w:b/>
+        </w:rPr>
+        <w:t xml:space="preserve">a partir do requerimento formulado na própria contestação</w:t>
+      </w:r>
+      <w:r>
+        <w:t xml:space="preserve"> </w:t>
+      </w:r>
+      <w:r>
+        <w:t xml:space="preserve">(ID 106243575), sem certidão de decurso de prazo ou de intempestividade: o Juízo recebeu a defesa e lhe deu seguimento. Além disso, no rito da Lei 9.099/1995, a revelia decorre do</w:t>
+      </w:r>
+      <w:r>
+        <w:t xml:space="preserve"> </w:t>
+      </w:r>
+      <w:r>
+        <w:rPr>
+          <w:bCs/>
+          <w:b/>
+        </w:rPr>
+        <w:t xml:space="preserve">não comparecimento do réu</w:t>
+      </w:r>
+      <w:r>
+        <w:t xml:space="preserve"> </w:t>
+      </w:r>
+      <w:r>
+        <w:t xml:space="preserve">(art. 20) ou, nas causas superiores a vinte salários mínimos, da</w:t>
+      </w:r>
+      <w:r>
+        <w:t xml:space="preserve"> </w:t>
+      </w:r>
+      <w:r>
+        <w:rPr>
+          <w:bCs/>
+          <w:b/>
+        </w:rPr>
+        <w:t xml:space="preserve">ausência de contestação</w:t>
+      </w:r>
+      <w:r>
+        <w:t xml:space="preserve"> </w:t>
+      </w:r>
+      <w:r>
+        <w:t xml:space="preserve">(Enunciado 11 do FONAJE), que é apresentada</w:t>
+      </w:r>
+      <w:r>
+        <w:t xml:space="preserve"> </w:t>
+      </w:r>
+      <w:r>
+        <w:rPr>
+          <w:bCs/>
+          <w:b/>
+        </w:rPr>
+        <w:t xml:space="preserve">na audiência</w:t>
+      </w:r>
+      <w:r>
+        <w:t xml:space="preserve"> </w:t>
+      </w:r>
+      <w:r>
+        <w:t xml:space="preserve">(art. 30) e, nos termos do</w:t>
+      </w:r>
+      <w:r>
+        <w:t xml:space="preserve"> </w:t>
+      </w:r>
+      <w:r>
+        <w:rPr>
+          <w:bCs/>
+          <w:b/>
+        </w:rPr>
+        <w:t xml:space="preserve">Enunciado 10 do FONAJE</w:t>
+      </w:r>
+      <w:r>
+        <w:t xml:space="preserve">,</w:t>
+      </w:r>
+      <w:r>
+        <w:t xml:space="preserve"> </w:t>
+      </w:r>
+      <w:r>
+        <w:t xml:space="preserve">‘</w:t>
+      </w:r>
+      <w:r>
+        <w:rPr>
+          <w:bCs/>
+          <w:b/>
+        </w:rPr>
+        <w:t xml:space="preserve">a contestação poderá ser apresentada até a audiência de Instrução e Julgamento</w:t>
+      </w:r>
+      <w:r>
+        <w:t xml:space="preserve">’</w:t>
+      </w:r>
+      <w:r>
+        <w:t xml:space="preserve">. Nenhuma das hipóteses ocorre. Ad cautelam, o requerido</w:t>
+      </w:r>
+      <w:r>
+        <w:t xml:space="preserve"> </w:t>
+      </w:r>
+      <w:r>
+        <w:rPr>
+          <w:bCs/>
+          <w:b/>
+        </w:rPr>
+        <w:t xml:space="preserve">ratifica neste ato a contestação de ID 106243575 e os documentos que a instruem</w:t>
+      </w:r>
+      <w:r>
+        <w:t xml:space="preserve">, requerendo que conste em ata.</w:t>
+      </w:r>
+    </w:p>
+    <w:p>
+      <w:pPr>
+        <w:pStyle w:val="BlockText"/>
+      </w:pPr>
+      <w:r>
+        <w:t xml:space="preserve">Por isso, a discussão sobre o termo inicial do prazo, inclusive à luz do Enunciado 13 do FONAJE, é</w:t>
+      </w:r>
+      <w:r>
+        <w:t xml:space="preserve"> </w:t>
+      </w:r>
+      <w:r>
+        <w:rPr>
+          <w:bCs/>
+          <w:b/>
+        </w:rPr>
+        <w:t xml:space="preserve">irrelevante</w:t>
+      </w:r>
+      <w:r>
+        <w:t xml:space="preserve">: ainda que se conte da ciência da citação, a defesa pode ser apresentada até a audiência de instrução, que sequer foi designada. De todo modo, a decisão de ID 100909958 fixou expressamente o art. 231 do CPC como termo inicial. O próprio prazo de 15 dias para contestação escrita não existe na Lei 9.099; é criação do CPC (art. 335) adotada pelo Juízo, e por isso o seu termo inicial segue o sistema do CPC que o Juízo expressamente indicou. Um comando judicial específico, dirigido à parte, prevalece sobre orientação genérica de enunciado. A defesa observou esse marco, em atenção à boa-fé e à proteção da confiança (arts. 5º e 6º do CPC), e, subsidiariamente, há justa causa (art. 223, §§ 1º e 2º, do CPC).”</w:t>
+      </w:r>
+    </w:p>
+    <w:bookmarkEnd w:id="27"/>
+    <w:bookmarkStart w:id="28" w:name="cuidados-durante-o-ato"/>
+    <w:p>
+      <w:pPr>
+        <w:pStyle w:val="Heading2"/>
+      </w:pPr>
+      <w:r>
+        <w:t xml:space="preserve">Cuidados durante o ato</w:t>
       </w:r>
     </w:p>
     <w:p>
       <w:pPr>
         <w:numPr>
           <w:ilvl w:val="0"/>
-          <w:numId w:val="1001"/>
+          <w:numId w:val="1003"/>
         </w:numPr>
         <w:pStyle w:val="Compact"/>
       </w:pPr>
@@ -2064,21 +2306,117 @@
           <w:bCs/>
           <w:b/>
         </w:rPr>
-        <w:t xml:space="preserve">Não discutir mérito com o autor/advogado</w:t>
-      </w:r>
-      <w:r>
-        <w:t xml:space="preserve">; limitar-se ao registro em ata.</w:t>
+        <w:t xml:space="preserve">Em qualquer cenário em que o processo prossiga, ratificar a contestação em ata.</w:t>
+      </w:r>
+      <w:r>
+        <w:t xml:space="preserve"> </w:t>
+      </w:r>
+      <w:r>
+        <w:t xml:space="preserve">Valor da causa (R$ 60.000,00) supera 20 salários mínimos: pelo Enunciado 11 do FONAJE, a revelia aqui depende da ausência de contestação; a ratificação resolve também o risco do Enunciado 13.</w:t>
       </w:r>
     </w:p>
     <w:p>
       <w:pPr>
         <w:numPr>
           <w:ilvl w:val="0"/>
-          <w:numId w:val="1001"/>
+          <w:numId w:val="1003"/>
         </w:numPr>
         <w:pStyle w:val="Compact"/>
       </w:pPr>
       <w:r>
+        <w:rPr>
+          <w:bCs/>
+          <w:b/>
+        </w:rPr>
+        <w:t xml:space="preserve">Não aceitar proposta de retratação genérica</w:t>
+      </w:r>
+      <w:r>
+        <w:t xml:space="preserve"> </w:t>
+      </w:r>
+      <w:r>
+        <w:t xml:space="preserve">(</w:t>
+      </w:r>
+      <w:r>
+        <w:t xml:space="preserve">“</w:t>
+      </w:r>
+      <w:r>
+        <w:t xml:space="preserve">reconhecer a inveracidade das imputações</w:t>
+      </w:r>
+      <w:r>
+        <w:t xml:space="preserve">”</w:t>
+      </w:r>
+      <w:r>
+        <w:t xml:space="preserve">). Se houver proposta, pedir prazo para consultar o cliente e que conste em ata.</w:t>
+      </w:r>
+    </w:p>
+    <w:p>
+      <w:pPr>
+        <w:numPr>
+          <w:ilvl w:val="0"/>
+          <w:numId w:val="1003"/>
+        </w:numPr>
+        <w:pStyle w:val="Compact"/>
+      </w:pPr>
+      <w:r>
+        <w:rPr>
+          <w:bCs/>
+          <w:b/>
+        </w:rPr>
+        <w:t xml:space="preserve">Opcional, a critério do cliente:</w:t>
+      </w:r>
+      <w:r>
+        <w:t xml:space="preserve"> </w:t>
+      </w:r>
+      <w:r>
+        <w:t xml:space="preserve">levar uma posição mínima, não confessional (ex.: reconhecer o fato já admitido na contestação, de que o inquérito foi arquivado com reconhecimento da origem lícita do numerário), para esvaziar a tese de que a audiência seria</w:t>
+      </w:r>
+      <w:r>
+        <w:t xml:space="preserve"> </w:t>
+      </w:r>
+      <w:r>
+        <w:t xml:space="preserve">“</w:t>
+      </w:r>
+      <w:r>
+        <w:t xml:space="preserve">pro forma</w:t>
+      </w:r>
+      <w:r>
+        <w:t xml:space="preserve">”</w:t>
+      </w:r>
+      <w:r>
+        <w:t xml:space="preserve"> </w:t>
+      </w:r>
+      <w:r>
+        <w:t xml:space="preserve">sem proposta concreta. Não é retratação.</w:t>
+      </w:r>
+    </w:p>
+    <w:p>
+      <w:pPr>
+        <w:numPr>
+          <w:ilvl w:val="0"/>
+          <w:numId w:val="1003"/>
+        </w:numPr>
+        <w:pStyle w:val="Compact"/>
+      </w:pPr>
+      <w:r>
+        <w:rPr>
+          <w:bCs/>
+          <w:b/>
+        </w:rPr>
+        <w:t xml:space="preserve">Não discutir mérito com o autor/advogado</w:t>
+      </w:r>
+      <w:r>
+        <w:t xml:space="preserve">; limitar-se ao registro em ata.</w:t>
+      </w:r>
+    </w:p>
+    <w:p>
+      <w:pPr>
+        <w:numPr>
+          <w:ilvl w:val="0"/>
+          <w:numId w:val="1003"/>
+        </w:numPr>
+        <w:pStyle w:val="Compact"/>
+      </w:pPr>
+      <w:r>
         <w:t xml:space="preserve">Conferir a ata</w:t>
       </w:r>
       <w:r>
@@ -2095,8 +2433,8 @@
         <w:t xml:space="preserve">: ausência do autor (se for o caso), presença pessoal do réu, ratificação da contestação e o pedido de extinção com o fundamento (art. 51, I e § 2º).</w:t>
       </w:r>
     </w:p>
-    <w:bookmarkEnd w:id="25"/>
-    <w:bookmarkStart w:id="26" w:name="cartão-de-citações-para-leitura-rápida"/>
+    <w:bookmarkEnd w:id="28"/>
+    <w:bookmarkStart w:id="29" w:name="cartão-de-citações-para-leitura-rápida"/>
     <w:p>
       <w:pPr>
         <w:pStyle w:val="Heading2"/>
@@ -2346,6 +2684,48 @@
               <w:jc w:val="left"/>
             </w:pPr>
             <w:r>
+              <w:t xml:space="preserve">Cancelamento</w:t>
+            </w:r>
+          </w:p>
+        </w:tc>
+        <w:tc>
+          <w:tcPr/>
+          <w:p>
+            <w:pPr>
+              <w:pStyle w:val="Compact"/>
+              <w:jc w:val="left"/>
+            </w:pPr>
+            <w:r>
+              <w:t xml:space="preserve">CPC art. 334, § 4º, I (desinteresse de</w:t>
+            </w:r>
+            <w:r>
+              <w:t xml:space="preserve"> </w:t>
+            </w:r>
+            <w:r>
+              <w:rPr>
+                <w:bCs/>
+                <w:b/>
+              </w:rPr>
+              <w:t xml:space="preserve">ambas</w:t>
+            </w:r>
+            <w:r>
+              <w:t xml:space="preserve"> </w:t>
+            </w:r>
+            <w:r>
+              <w:t xml:space="preserve">as partes); FONAJE 15 (sem agravo; impugnar em recurso inominado)</w:t>
+            </w:r>
+          </w:p>
+        </w:tc>
+      </w:tr>
+      <w:tr>
+        <w:tc>
+          <w:tcPr/>
+          <w:p>
+            <w:pPr>
+              <w:pStyle w:val="Compact"/>
+              <w:jc w:val="left"/>
+            </w:pPr>
+            <w:r>
               <w:t xml:space="preserve">Normas</w:t>
             </w:r>
           </w:p>
@@ -2364,8 +2744,8 @@
         </w:tc>
       </w:tr>
     </w:tbl>
-    <w:bookmarkEnd w:id="26"/>
-    <w:bookmarkEnd w:id="27"/>
+    <w:bookmarkEnd w:id="29"/>
+    <w:bookmarkEnd w:id="30"/>
     <w:sectPr>
       <w:pgSz w:h="16838" w:w="11906"/>
       <w:pgMar w:bottom="1134" w:footer="567" w:gutter="0" w:header="567" w:left="1418" w:right="1134" w:top="1134"/>
@@ -2551,10 +2931,128 @@
       </w:pPr>
     </w:lvl>
   </w:abstractNum>
+  <w:abstractNum w:abstractNumId="99411">
+    <w:nsid w:val="A99411"/>
+    <w:multiLevelType w:val="multilevel"/>
+    <w:lvl w:ilvl="0">
+      <w:start w:val="1"/>
+      <w:numFmt w:val="decimal"/>
+      <w:lvlText w:val="%1."/>
+      <w:lvlJc w:val="left"/>
+      <w:pPr>
+        <w:ind w:left="720" w:hanging="480"/>
+      </w:pPr>
+    </w:lvl>
+    <w:lvl w:ilvl="1">
+      <w:start w:val="1"/>
+      <w:numFmt w:val="decimal"/>
+      <w:lvlText w:val="%2."/>
+      <w:lvlJc w:val="left"/>
+      <w:pPr>
+        <w:ind w:left="1440" w:hanging="480"/>
+      </w:pPr>
+    </w:lvl>
+    <w:lvl w:ilvl="2">
+      <w:start w:val="1"/>
+      <w:numFmt w:val="decimal"/>
+      <w:lvlText w:val="%3."/>
+      <w:lvlJc w:val="left"/>
+      <w:pPr>
+        <w:ind w:left="2160" w:hanging="480"/>
+      </w:pPr>
+    </w:lvl>
+    <w:lvl w:ilvl="3">
+      <w:start w:val="1"/>
+      <w:numFmt w:val="decimal"/>
+      <w:lvlText w:val="%4."/>
+      <w:lvlJc w:val="left"/>
+      <w:pPr>
+        <w:ind w:left="2880" w:hanging="480"/>
+      </w:pPr>
+    </w:lvl>
+    <w:lvl w:ilvl="4">
+      <w:start w:val="1"/>
+      <w:numFmt w:val="decimal"/>
+      <w:lvlText w:val="%5."/>
+      <w:lvlJc w:val="left"/>
+      <w:pPr>
+        <w:ind w:left="3600" w:hanging="480"/>
+      </w:pPr>
+    </w:lvl>
+    <w:lvl w:ilvl="5">
+      <w:start w:val="1"/>
+      <w:numFmt w:val="decimal"/>
+      <w:lvlText w:val="%6."/>
+      <w:lvlJc w:val="left"/>
+      <w:pPr>
+        <w:ind w:left="4320" w:hanging="480"/>
+      </w:pPr>
+    </w:lvl>
+    <w:lvl w:ilvl="6">
+      <w:start w:val="1"/>
+      <w:numFmt w:val="decimal"/>
+      <w:lvlText w:val="%7."/>
+      <w:lvlJc w:val="left"/>
+      <w:pPr>
+        <w:ind w:left="5040" w:hanging="480"/>
+      </w:pPr>
+    </w:lvl>
+    <w:lvl w:ilvl="7">
+      <w:start w:val="1"/>
+      <w:numFmt w:val="decimal"/>
+      <w:lvlText w:val="%8."/>
+      <w:lvlJc w:val="left"/>
+      <w:pPr>
+        <w:ind w:left="5760" w:hanging="480"/>
+      </w:pPr>
+    </w:lvl>
+    <w:lvl w:ilvl="8">
+      <w:start w:val="1"/>
+      <w:numFmt w:val="decimal"/>
+      <w:lvlText w:val="%9."/>
+      <w:lvlJc w:val="left"/>
+      <w:pPr>
+        <w:ind w:left="6480" w:hanging="480"/>
+      </w:pPr>
+    </w:lvl>
+  </w:abstractNum>
   <w:num w:numId="1000">
     <w:abstractNumId w:val="990"/>
   </w:num>
   <w:num w:numId="1001">
+    <w:abstractNumId w:val="991"/>
+  </w:num>
+  <w:num w:numId="1002">
+    <w:abstractNumId w:val="99411"/>
+    <w:lvlOverride w:ilvl="0">
+      <w:startOverride w:val="1"/>
+    </w:lvlOverride>
+    <w:lvlOverride w:ilvl="1">
+      <w:startOverride w:val="1"/>
+    </w:lvlOverride>
+    <w:lvlOverride w:ilvl="2">
+      <w:startOverride w:val="1"/>
+    </w:lvlOverride>
+    <w:lvlOverride w:ilvl="3">
+      <w:startOverride w:val="1"/>
+    </w:lvlOverride>
+    <w:lvlOverride w:ilvl="4">
+      <w:startOverride w:val="1"/>
+    </w:lvlOverride>
+    <w:lvlOverride w:ilvl="5">
+      <w:startOverride w:val="1"/>
+    </w:lvlOverride>
+    <w:lvlOverride w:ilvl="6">
+      <w:startOverride w:val="1"/>
+    </w:lvlOverride>
+    <w:lvlOverride w:ilvl="7">
+      <w:startOverride w:val="1"/>
+    </w:lvlOverride>
+    <w:lvlOverride w:ilvl="8">
+      <w:startOverride w:val="1"/>
+    </w:lvlOverride>
+  </w:num>
+  <w:num w:numId="1003">
     <w:abstractNumId w:val="991"/>
   </w:num>
 </w:numbering>

</xml_diff>

<commit_message>
Pedido oral: justificativa para não apresentar proposta no Cenário A e proposta no Cenário B
Co-Authored-By: Claude Opus 5.5 <noreply@anthropic.com>
Claude-Session: https://claude.ai/code/session_01CUmiv8ZKDC5VxLQ3BigcLo
</commit_message>
<xml_diff>
--- a/0800990-83.2026 - Ely Sandro/Pedido oral - audiência de conciliação 22-10-2026.docx
+++ b/0800990-83.2026 - Ely Sandro/Pedido oral - audiência de conciliação 22-10-2026.docx
@@ -643,6 +643,53 @@
         <w:pStyle w:val="BlockText"/>
       </w:pPr>
       <w:r>
+        <w:t xml:space="preserve">Por essas razões, o requerido</w:t>
+      </w:r>
+      <w:r>
+        <w:t xml:space="preserve"> </w:t>
+      </w:r>
+      <w:r>
+        <w:rPr>
+          <w:bCs/>
+          <w:b/>
+        </w:rPr>
+        <w:t xml:space="preserve">deixa de apresentar proposta de acordo neste ato</w:t>
+      </w:r>
+      <w:r>
+        <w:t xml:space="preserve">, não por falta de disposição conciliatória, que mantém e manifestou na contestação, mas porque</w:t>
+      </w:r>
+      <w:r>
+        <w:t xml:space="preserve"> </w:t>
+      </w:r>
+      <w:r>
+        <w:rPr>
+          <w:bCs/>
+          <w:b/>
+        </w:rPr>
+        <w:t xml:space="preserve">não há interlocutor válido</w:t>
+      </w:r>
+      <w:r>
+        <w:t xml:space="preserve">: o autor não compareceu, declarou nos autos que não tem interesse na composição, e o advogado presente não possui procuração nem poderes especiais para transigir, que não podem ser verbais (art. 9º, § 3º). Qualquer proposta seria inócua e não poderia ser aceita validamente em nome do autor. A ausência de proposta decorre, portanto,</w:t>
+      </w:r>
+      <w:r>
+        <w:t xml:space="preserve"> </w:t>
+      </w:r>
+      <w:r>
+        <w:rPr>
+          <w:bCs/>
+          <w:b/>
+        </w:rPr>
+        <w:t xml:space="preserve">exclusivamente da conduta do autor</w:t>
+      </w:r>
+      <w:r>
+        <w:t xml:space="preserve">, e não do requerido.</w:t>
+      </w:r>
+    </w:p>
+    <w:p>
+      <w:pPr>
+        <w:pStyle w:val="BlockText"/>
+      </w:pPr>
+      <w:r>
         <w:t xml:space="preserve">Diante disso, requer:</w:t>
       </w:r>
     </w:p>
@@ -1207,7 +1254,7 @@
         <w:t xml:space="preserve">deliberada e anunciada</w:t>
       </w:r>
       <w:r>
-        <w:t xml:space="preserve">: o autor declarou nos autos que não quer transigir, de modo que o advogado comparece com a ordem do próprio mandante de não compor. Quem frustrou a finalidade do ato foi o autor, não o réu, que está presente pessoalmente. Segundo, aquele precedente pressupõe advogado</w:t>
+        <w:t xml:space="preserve">: o autor declarou nos autos que não quer transigir, de modo que o advogado comparece com a ordem do próprio mandante de não compor. Quem frustrou a finalidade do ato foi o autor, não o réu, que está presente pessoalmente. Se não há proposta sobre a mesa, é porque não há com quem transigir validamente: o autor está ausente e seu advogado não tem procuração. Segundo, aquele precedente pressupõe advogado</w:t>
       </w:r>
       <w:r>
         <w:t xml:space="preserve"> </w:t>
@@ -1708,6 +1755,27 @@
       </w:r>
       <w:r>
         <w:t xml:space="preserve">, requerendo que conste em ata.</w:t>
+      </w:r>
+    </w:p>
+    <w:p>
+      <w:pPr>
+        <w:pStyle w:val="BlockText"/>
+      </w:pPr>
+      <w:r>
+        <w:t xml:space="preserve">O requerido apresenta, neste ato,</w:t>
+      </w:r>
+      <w:r>
+        <w:t xml:space="preserve"> </w:t>
+      </w:r>
+      <w:r>
+        <w:rPr>
+          <w:bCs/>
+          <w:b/>
+        </w:rPr>
+        <w:t xml:space="preserve">proposta concreta de acordo</w:t>
+      </w:r>
+      <w:r>
+        <w:t xml:space="preserve">, nos termos da petição que ora exibe (nota de esclarecimento factual, sem pagamento, sem remoção de conteúdo, sem reconhecimento de culpa, com extinção do processo e quitação recíproca), requerendo que conste em ata e que o autor se manifeste.</w:t>
       </w:r>
     </w:p>
     <w:p>
@@ -2347,6 +2415,121 @@
       </w:r>
       <w:r>
         <w:t xml:space="preserve">). Se houver proposta, pedir prazo para consultar o cliente e que conste em ata.</w:t>
+      </w:r>
+    </w:p>
+    <w:p>
+      <w:pPr>
+        <w:numPr>
+          <w:ilvl w:val="0"/>
+          <w:numId w:val="1003"/>
+        </w:numPr>
+        <w:pStyle w:val="Compact"/>
+      </w:pPr>
+      <w:r>
+        <w:rPr>
+          <w:bCs/>
+          <w:b/>
+        </w:rPr>
+        <w:t xml:space="preserve">Proposta de acordo, por cenário</w:t>
+      </w:r>
+      <w:r>
+        <w:t xml:space="preserve"> </w:t>
+      </w:r>
+      <w:r>
+        <w:t xml:space="preserve">(arquivo</w:t>
+      </w:r>
+      <w:r>
+        <w:t xml:space="preserve"> </w:t>
+      </w:r>
+      <w:r>
+        <w:rPr>
+          <w:iCs/>
+          <w:i/>
+        </w:rPr>
+        <w:t xml:space="preserve">Proposta de acordo - 22-10-2026</w:t>
+      </w:r>
+      <w:r>
+        <w:t xml:space="preserve">):</w:t>
+      </w:r>
+      <w:r>
+        <w:t xml:space="preserve"> </w:t>
+      </w:r>
+      <w:r>
+        <w:rPr>
+          <w:bCs/>
+          <w:b/>
+        </w:rPr>
+        <w:t xml:space="preserve">Cenário A</w:t>
+      </w:r>
+      <w:r>
+        <w:t xml:space="preserve"> </w:t>
+      </w:r>
+      <w:r>
+        <w:t xml:space="preserve">→</w:t>
+      </w:r>
+      <w:r>
+        <w:t xml:space="preserve"> </w:t>
+      </w:r>
+      <w:r>
+        <w:rPr>
+          <w:bCs/>
+          <w:b/>
+        </w:rPr>
+        <w:t xml:space="preserve">não apresentar</w:t>
+      </w:r>
+      <w:r>
+        <w:t xml:space="preserve"> </w:t>
+      </w:r>
+      <w:r>
+        <w:t xml:space="preserve">e justificar (autor ausente, sem procuração, sem interlocutor válido);</w:t>
+      </w:r>
+      <w:r>
+        <w:t xml:space="preserve"> </w:t>
+      </w:r>
+      <w:r>
+        <w:rPr>
+          <w:bCs/>
+          <w:b/>
+        </w:rPr>
+        <w:t xml:space="preserve">Cenário B</w:t>
+      </w:r>
+      <w:r>
+        <w:t xml:space="preserve"> </w:t>
+      </w:r>
+      <w:r>
+        <w:t xml:space="preserve">→</w:t>
+      </w:r>
+      <w:r>
+        <w:t xml:space="preserve"> </w:t>
+      </w:r>
+      <w:r>
+        <w:rPr>
+          <w:bCs/>
+          <w:b/>
+        </w:rPr>
+        <w:t xml:space="preserve">apresentar</w:t>
+      </w:r>
+      <w:r>
+        <w:t xml:space="preserve"> </w:t>
+      </w:r>
+      <w:r>
+        <w:t xml:space="preserve">a proposta e pedir registro em ata;</w:t>
+      </w:r>
+      <w:r>
+        <w:t xml:space="preserve"> </w:t>
+      </w:r>
+      <w:r>
+        <w:rPr>
+          <w:bCs/>
+          <w:b/>
+        </w:rPr>
+        <w:t xml:space="preserve">Cenário C2</w:t>
+      </w:r>
+      <w:r>
+        <w:t xml:space="preserve"> </w:t>
+      </w:r>
+      <w:r>
+        <w:t xml:space="preserve">→ protocolar a proposta é opcional, para registrar boa-fé.</w:t>
       </w:r>
     </w:p>
     <w:p>

</xml_diff>

<commit_message>
Roteiro final: mapa de decisão, proposta de acordo integrada e anexo
Co-Authored-By: Claude Opus 5.5 <noreply@anthropic.com>
Claude-Session: https://claude.ai/code/session_01CUmiv8ZKDC5VxLQ3BigcLo
</commit_message>
<xml_diff>
--- a/0800990-83.2026 - Ely Sandro/Pedido oral - audiência de conciliação 22-10-2026.docx
+++ b/0800990-83.2026 - Ely Sandro/Pedido oral - audiência de conciliação 22-10-2026.docx
@@ -2,7 +2,7 @@
 <file path=word/document.xml><?xml version="1.0" encoding="utf-8"?>
 <w:document xmlns:w="http://schemas.openxmlformats.org/wordprocessingml/2006/main" xmlns:m="http://schemas.openxmlformats.org/officeDocument/2006/math" xmlns:r="http://schemas.openxmlformats.org/officeDocument/2006/relationships" xmlns:o="urn:schemas-microsoft-com:office:office" xmlns:v="urn:schemas-microsoft-com:vml" xmlns:w10="urn:schemas-microsoft-com:office:word" xmlns:a="http://schemas.openxmlformats.org/drawingml/2006/main" xmlns:pic="http://schemas.openxmlformats.org/drawingml/2006/picture" xmlns:wp="http://schemas.openxmlformats.org/drawingml/2006/wordprocessingDrawing">
   <w:body>
-    <w:bookmarkStart w:id="30" w:name="Xa28dfabad047e90ef0866cbad0bdd7a86ecae39"/>
+    <w:bookmarkStart w:id="31" w:name="Xa28dfabad047e90ef0866cbad0bdd7a86ecae39"/>
     <w:p>
       <w:pPr>
         <w:pStyle w:val="Heading1"/>
@@ -55,12 +55,344 @@
         <w:t xml:space="preserve">Ely Sandro Vaz e Silva</w:t>
       </w:r>
     </w:p>
-    <w:bookmarkStart w:id="20" w:name="antes-de-abrir-a-sessão"/>
+    <w:bookmarkStart w:id="20" w:name="mapa-de-decisão"/>
     <w:p>
       <w:pPr>
         <w:pStyle w:val="Heading2"/>
       </w:pPr>
       <w:r>
+        <w:t xml:space="preserve">Mapa de decisão</w:t>
+      </w:r>
+    </w:p>
+    <w:tbl>
+      <w:tblPr>
+        <w:tblStyle w:val="Table"/>
+        <w:tblW w:type="pct" w:w="5000"/>
+        <w:tblLook w:firstRow="1" w:lastRow="0" w:firstColumn="0" w:lastColumn="0" w:noHBand="0" w:noVBand="0" w:val="0020"/>
+        <w:jc w:val="start"/>
+      </w:tblPr>
+      <w:tblGrid>
+        <w:gridCol w:w="2640"/>
+        <w:gridCol w:w="2640"/>
+        <w:gridCol w:w="2640"/>
+      </w:tblGrid>
+      <w:tr>
+        <w:trPr>
+          <w:tblHeader w:val="true"/>
+        </w:trPr>
+        <w:tc>
+          <w:tcPr/>
+          <w:p>
+            <w:pPr>
+              <w:pStyle w:val="Compact"/>
+              <w:jc w:val="left"/>
+            </w:pPr>
+            <w:r>
+              <w:t xml:space="preserve">Situação na abertura</w:t>
+            </w:r>
+          </w:p>
+        </w:tc>
+        <w:tc>
+          <w:tcPr/>
+          <w:p>
+            <w:pPr>
+              <w:pStyle w:val="Compact"/>
+              <w:jc w:val="left"/>
+            </w:pPr>
+            <w:r>
+              <w:t xml:space="preserve">Cenário</w:t>
+            </w:r>
+          </w:p>
+        </w:tc>
+        <w:tc>
+          <w:tcPr/>
+          <w:p>
+            <w:pPr>
+              <w:pStyle w:val="Compact"/>
+              <w:jc w:val="left"/>
+            </w:pPr>
+            <w:r>
+              <w:t xml:space="preserve">Proposta de acordo</w:t>
+            </w:r>
+          </w:p>
+        </w:tc>
+      </w:tr>
+      <w:tr>
+        <w:tc>
+          <w:tcPr/>
+          <w:p>
+            <w:pPr>
+              <w:pStyle w:val="Compact"/>
+              <w:jc w:val="left"/>
+            </w:pPr>
+            <w:r>
+              <w:t xml:space="preserve">Despacho no PJe cancelou a audiência</w:t>
+            </w:r>
+          </w:p>
+        </w:tc>
+        <w:tc>
+          <w:tcPr/>
+          <w:p>
+            <w:pPr>
+              <w:pStyle w:val="Compact"/>
+              <w:jc w:val="left"/>
+            </w:pPr>
+            <w:r>
+              <w:rPr>
+                <w:bCs/>
+                <w:b/>
+              </w:rPr>
+              <w:t xml:space="preserve">C2</w:t>
+            </w:r>
+            <w:r>
+              <w:t xml:space="preserve"> </w:t>
+            </w:r>
+            <w:r>
+              <w:t xml:space="preserve">(petição)</w:t>
+            </w:r>
+          </w:p>
+        </w:tc>
+        <w:tc>
+          <w:tcPr/>
+          <w:p>
+            <w:pPr>
+              <w:pStyle w:val="Compact"/>
+              <w:jc w:val="left"/>
+            </w:pPr>
+            <w:r>
+              <w:t xml:space="preserve">Protocolo opcional, para registrar boa-fé</w:t>
+            </w:r>
+          </w:p>
+        </w:tc>
+      </w:tr>
+      <w:tr>
+        <w:tc>
+          <w:tcPr/>
+          <w:p>
+            <w:pPr>
+              <w:pStyle w:val="Compact"/>
+              <w:jc w:val="left"/>
+            </w:pPr>
+            <w:r>
+              <w:t xml:space="preserve">Juiz/conciliador cancela na abertura do ato</w:t>
+            </w:r>
+          </w:p>
+        </w:tc>
+        <w:tc>
+          <w:tcPr/>
+          <w:p>
+            <w:pPr>
+              <w:pStyle w:val="Compact"/>
+              <w:jc w:val="left"/>
+            </w:pPr>
+            <w:r>
+              <w:rPr>
+                <w:bCs/>
+                <w:b/>
+              </w:rPr>
+              <w:t xml:space="preserve">C1</w:t>
+            </w:r>
+            <w:r>
+              <w:t xml:space="preserve"> </w:t>
+            </w:r>
+            <w:r>
+              <w:t xml:space="preserve">(registro e protesto)</w:t>
+            </w:r>
+          </w:p>
+        </w:tc>
+        <w:tc>
+          <w:tcPr/>
+          <w:p>
+            <w:pPr>
+              <w:pStyle w:val="Compact"/>
+              <w:jc w:val="left"/>
+            </w:pPr>
+            <w:r>
+              <w:t xml:space="preserve">Não apresentar</w:t>
+            </w:r>
+          </w:p>
+        </w:tc>
+      </w:tr>
+      <w:tr>
+        <w:tc>
+          <w:tcPr/>
+          <w:p>
+            <w:pPr>
+              <w:pStyle w:val="Compact"/>
+              <w:jc w:val="left"/>
+            </w:pPr>
+            <w:r>
+              <w:t xml:space="preserve">Autor ausente; presente só o advogado</w:t>
+            </w:r>
+          </w:p>
+        </w:tc>
+        <w:tc>
+          <w:tcPr/>
+          <w:p>
+            <w:pPr>
+              <w:pStyle w:val="Compact"/>
+              <w:jc w:val="left"/>
+            </w:pPr>
+            <w:r>
+              <w:rPr>
+                <w:bCs/>
+                <w:b/>
+              </w:rPr>
+              <w:t xml:space="preserve">A</w:t>
+            </w:r>
+            <w:r>
+              <w:t xml:space="preserve"> </w:t>
+            </w:r>
+            <w:r>
+              <w:t xml:space="preserve">(extinção, art. 51, I)</w:t>
+            </w:r>
+          </w:p>
+        </w:tc>
+        <w:tc>
+          <w:tcPr/>
+          <w:p>
+            <w:pPr>
+              <w:pStyle w:val="Compact"/>
+              <w:jc w:val="left"/>
+            </w:pPr>
+            <w:r>
+              <w:rPr>
+                <w:bCs/>
+                <w:b/>
+              </w:rPr>
+              <w:t xml:space="preserve">Não apresentar</w:t>
+            </w:r>
+            <w:r>
+              <w:t xml:space="preserve"> </w:t>
+            </w:r>
+            <w:r>
+              <w:t xml:space="preserve">e justificar</w:t>
+            </w:r>
+          </w:p>
+        </w:tc>
+      </w:tr>
+      <w:tr>
+        <w:tc>
+          <w:tcPr/>
+          <w:p>
+            <w:pPr>
+              <w:pStyle w:val="Compact"/>
+              <w:jc w:val="left"/>
+            </w:pPr>
+            <w:r>
+              <w:t xml:space="preserve">Autor presente pessoalmente</w:t>
+            </w:r>
+          </w:p>
+        </w:tc>
+        <w:tc>
+          <w:tcPr/>
+          <w:p>
+            <w:pPr>
+              <w:pStyle w:val="Compact"/>
+              <w:jc w:val="left"/>
+            </w:pPr>
+            <w:r>
+              <w:rPr>
+                <w:bCs/>
+                <w:b/>
+              </w:rPr>
+              <w:t xml:space="preserve">B</w:t>
+            </w:r>
+            <w:r>
+              <w:t xml:space="preserve"> </w:t>
+            </w:r>
+            <w:r>
+              <w:t xml:space="preserve">(registro, ratificação, julgamento antecipado)</w:t>
+            </w:r>
+          </w:p>
+        </w:tc>
+        <w:tc>
+          <w:tcPr/>
+          <w:p>
+            <w:pPr>
+              <w:pStyle w:val="Compact"/>
+              <w:jc w:val="left"/>
+            </w:pPr>
+            <w:r>
+              <w:rPr>
+                <w:bCs/>
+                <w:b/>
+              </w:rPr>
+              <w:t xml:space="preserve">Apresentar</w:t>
+            </w:r>
+            <w:r>
+              <w:t xml:space="preserve"> </w:t>
+            </w:r>
+            <w:r>
+              <w:t xml:space="preserve">(Anexo)</w:t>
+            </w:r>
+          </w:p>
+        </w:tc>
+      </w:tr>
+      <w:tr>
+        <w:tc>
+          <w:tcPr/>
+          <w:p>
+            <w:pPr>
+              <w:pStyle w:val="Compact"/>
+              <w:jc w:val="left"/>
+            </w:pPr>
+            <w:r>
+              <w:t xml:space="preserve">Em qualquer cenário, se alegarem intempestividade</w:t>
+            </w:r>
+          </w:p>
+        </w:tc>
+        <w:tc>
+          <w:tcPr/>
+          <w:p>
+            <w:pPr>
+              <w:pStyle w:val="Compact"/>
+              <w:jc w:val="left"/>
+            </w:pPr>
+            <w:r>
+              <w:t xml:space="preserve">Bloco próprio</w:t>
+            </w:r>
+          </w:p>
+        </w:tc>
+        <w:tc>
+          <w:tcPr/>
+          <w:p>
+            <w:pPr>
+              <w:pStyle w:val="Compact"/>
+              <w:jc w:val="left"/>
+            </w:pPr>
+            <w:r>
+              <w:t xml:space="preserve">—</w:t>
+            </w:r>
+          </w:p>
+        </w:tc>
+      </w:tr>
+    </w:tbl>
+    <w:p>
+      <w:pPr>
+        <w:pStyle w:val="BodyText"/>
+      </w:pPr>
+      <w:r>
+        <w:rPr>
+          <w:bCs/>
+          <w:b/>
+        </w:rPr>
+        <w:t xml:space="preserve">Em todos os cenários em que o processo prosseguir:</w:t>
+      </w:r>
+      <w:r>
+        <w:t xml:space="preserve"> </w:t>
+      </w:r>
+      <w:r>
+        <w:t xml:space="preserve">ratificar a contestação em ata e registrar a ausência de procuração do autor.</w:t>
+      </w:r>
+    </w:p>
+    <w:bookmarkEnd w:id="20"/>
+    <w:bookmarkStart w:id="21" w:name="antes-de-abrir-a-sessão"/>
+    <w:p>
+      <w:pPr>
+        <w:pStyle w:val="Heading2"/>
+      </w:pPr>
+      <w:r>
         <w:t xml:space="preserve">Antes de abrir a sessão</w:t>
       </w:r>
     </w:p>
@@ -209,8 +541,69 @@
         <w:t xml:space="preserve">para apreciação do juiz.</w:t>
       </w:r>
     </w:p>
-    <w:bookmarkEnd w:id="20"/>
-    <w:bookmarkStart w:id="22" w:name="Xd269fb8b4222fc61946c3c197a01317aa1110e8"/>
+    <w:p>
+      <w:pPr>
+        <w:pStyle w:val="BodyText"/>
+      </w:pPr>
+      <w:r>
+        <w:t xml:space="preserve">☐</w:t>
+      </w:r>
+      <w:r>
+        <w:t xml:space="preserve"> </w:t>
+      </w:r>
+      <w:r>
+        <w:rPr>
+          <w:bCs/>
+          <w:b/>
+        </w:rPr>
+        <w:t xml:space="preserve">Proposta de acordo:</w:t>
+      </w:r>
+      <w:r>
+        <w:t xml:space="preserve"> </w:t>
+      </w:r>
+      <w:r>
+        <w:t xml:space="preserve">autorização do Ely Sandro para os termos do Anexo (em especial a nota e a Cláusula 6ª) e procuração dele (ID 105179160)</w:t>
+      </w:r>
+      <w:r>
+        <w:t xml:space="preserve"> </w:t>
+      </w:r>
+      <w:r>
+        <w:rPr>
+          <w:bCs/>
+          <w:b/>
+        </w:rPr>
+        <w:t xml:space="preserve">com poderes para transigir</w:t>
+      </w:r>
+      <w:r>
+        <w:t xml:space="preserve">. Sem esses dois itens, não apresentar a proposta.</w:t>
+      </w:r>
+    </w:p>
+    <w:p>
+      <w:pPr>
+        <w:pStyle w:val="BodyText"/>
+      </w:pPr>
+      <w:r>
+        <w:t xml:space="preserve">☐ Ter impressa a</w:t>
+      </w:r>
+      <w:r>
+        <w:t xml:space="preserve"> </w:t>
+      </w:r>
+      <w:r>
+        <w:rPr>
+          <w:bCs/>
+          <w:b/>
+        </w:rPr>
+        <w:t xml:space="preserve">Proposta de acordo</w:t>
+      </w:r>
+      <w:r>
+        <w:t xml:space="preserve"> </w:t>
+      </w:r>
+      <w:r>
+        <w:t xml:space="preserve">(Anexo) para exibir no Cenário B.</w:t>
+      </w:r>
+    </w:p>
+    <w:bookmarkEnd w:id="21"/>
+    <w:bookmarkStart w:id="23" w:name="Xd269fb8b4222fc61946c3c197a01317aa1110e8"/>
     <w:p>
       <w:pPr>
         <w:pStyle w:val="Heading2"/>
@@ -972,7 +1365,7 @@
         <w:t xml:space="preserve">São os requerimentos.”</w:t>
       </w:r>
     </w:p>
-    <w:bookmarkStart w:id="21" w:name="réplicas-rápidas-cenário-a"/>
+    <w:bookmarkStart w:id="22" w:name="réplicas-rápidas-cenário-a"/>
     <w:p>
       <w:pPr>
         <w:pStyle w:val="Heading3"/>
@@ -1651,9 +2044,9 @@
         <w:t xml:space="preserve">da regularização. Reitera-se, assim, o pedido de extinção, sem prejuízo do prazo eventualmente concedido.”</w:t>
       </w:r>
     </w:p>
-    <w:bookmarkEnd w:id="21"/>
     <w:bookmarkEnd w:id="22"/>
-    <w:bookmarkStart w:id="23" w:name="X0a87f8a79577afccfa50d8c3536389a4ba6b760"/>
+    <w:bookmarkEnd w:id="23"/>
+    <w:bookmarkStart w:id="24" w:name="X0a87f8a79577afccfa50d8c3536389a4ba6b760"/>
     <w:p>
       <w:pPr>
         <w:pStyle w:val="Heading2"/>
@@ -1762,7 +2155,7 @@
         <w:pStyle w:val="BlockText"/>
       </w:pPr>
       <w:r>
-        <w:t xml:space="preserve">O requerido apresenta, neste ato,</w:t>
+        <w:t xml:space="preserve">Em demonstração de efetiva disposição conciliatória, o requerido apresenta, neste ato,</w:t>
       </w:r>
       <w:r>
         <w:t xml:space="preserve"> </w:t>
@@ -1775,7 +2168,84 @@
         <w:t xml:space="preserve">proposta concreta de acordo</w:t>
       </w:r>
       <w:r>
-        <w:t xml:space="preserve">, nos termos da petição que ora exibe (nota de esclarecimento factual, sem pagamento, sem remoção de conteúdo, sem reconhecimento de culpa, com extinção do processo e quitação recíproca), requerendo que conste em ata e que o autor se manifeste.</w:t>
+        <w:t xml:space="preserve">, nos seguintes termos: (i) o requerido publicará, uma única vez, em seu perfil no Facebook,</w:t>
+      </w:r>
+      <w:r>
+        <w:t xml:space="preserve"> </w:t>
+      </w:r>
+      <w:r>
+        <w:rPr>
+          <w:bCs/>
+          <w:b/>
+        </w:rPr>
+        <w:t xml:space="preserve">nota de esclarecimento</w:t>
+      </w:r>
+      <w:r>
+        <w:t xml:space="preserve"> </w:t>
+      </w:r>
+      <w:r>
+        <w:t xml:space="preserve">informando que o Inquérito Policial nº 0816146-68.2026.8.18.0140 foi arquivado por decisão de 24/06/2026, com reconhecimento da origem lícita do valor de R$ 147.300,00, mantendo-a por 7 dias; (ii)</w:t>
+      </w:r>
+      <w:r>
+        <w:t xml:space="preserve"> </w:t>
+      </w:r>
+      <w:r>
+        <w:rPr>
+          <w:bCs/>
+          <w:b/>
+        </w:rPr>
+        <w:t xml:space="preserve">sem pagamento</w:t>
+      </w:r>
+      <w:r>
+        <w:t xml:space="preserve"> </w:t>
+      </w:r>
+      <w:r>
+        <w:t xml:space="preserve">de qualquer valor, sem remoção de conteúdo e sem obrigação de abstenção; (iii)</w:t>
+      </w:r>
+      <w:r>
+        <w:t xml:space="preserve"> </w:t>
+      </w:r>
+      <w:r>
+        <w:rPr>
+          <w:bCs/>
+          <w:b/>
+        </w:rPr>
+        <w:t xml:space="preserve">sem reconhecimento</w:t>
+      </w:r>
+      <w:r>
+        <w:t xml:space="preserve"> </w:t>
+      </w:r>
+      <w:r>
+        <w:t xml:space="preserve">de ilicitude, culpa ou inveracidade e sem renúncia à imunidade parlamentar; (iv) o autor</w:t>
+      </w:r>
+      <w:r>
+        <w:t xml:space="preserve"> </w:t>
+      </w:r>
+      <w:r>
+        <w:rPr>
+          <w:bCs/>
+          <w:b/>
+        </w:rPr>
+        <w:t xml:space="preserve">renuncia ao direito</w:t>
+      </w:r>
+      <w:r>
+        <w:t xml:space="preserve"> </w:t>
+      </w:r>
+      <w:r>
+        <w:t xml:space="preserve">em que se funda a ação, com extinção do processo com resolução do mérito e</w:t>
+      </w:r>
+      <w:r>
+        <w:t xml:space="preserve"> </w:t>
+      </w:r>
+      <w:r>
+        <w:rPr>
+          <w:bCs/>
+          <w:b/>
+        </w:rPr>
+        <w:t xml:space="preserve">quitação recíproca</w:t>
+      </w:r>
+      <w:r>
+        <w:t xml:space="preserve">; (v) cada parte arca com os honorários de seu advogado. Requer que a proposta conste em ata, com a juntada da petição escrita, e que o autor se manifeste.</w:t>
       </w:r>
     </w:p>
     <w:p>
@@ -1878,8 +2348,93 @@
         <w:t xml:space="preserve">São os requerimentos.”</w:t>
       </w:r>
     </w:p>
-    <w:bookmarkEnd w:id="23"/>
-    <w:bookmarkStart w:id="26" w:name="cenário-c-o-juiz-cancela-a-audiência"/>
+    <w:p>
+      <w:pPr>
+        <w:pStyle w:val="FirstParagraph"/>
+      </w:pPr>
+      <w:r>
+        <w:rPr>
+          <w:bCs/>
+          <w:b/>
+        </w:rPr>
+        <w:t xml:space="preserve">Se o autor fizer contraproposta:</w:t>
+      </w:r>
+      <w:r>
+        <w:t xml:space="preserve"> </w:t>
+      </w:r>
+      <w:r>
+        <w:t xml:space="preserve">não aceitar na hora. Pedir que conste em ata e requerer prazo (5 dias) para consulta ao cliente.</w:t>
+      </w:r>
+      <w:r>
+        <w:t xml:space="preserve"> </w:t>
+      </w:r>
+      <w:r>
+        <w:rPr>
+          <w:bCs/>
+          <w:b/>
+        </w:rPr>
+        <w:t xml:space="preserve">Não aceitar</w:t>
+      </w:r>
+      <w:r>
+        <w:t xml:space="preserve"> </w:t>
+      </w:r>
+      <w:r>
+        <w:t xml:space="preserve">retratação genérica, pagamento, remoção de vídeos ou abstenção de manifestações futuras sem autorização expressa do cliente.</w:t>
+      </w:r>
+    </w:p>
+    <w:p>
+      <w:pPr>
+        <w:pStyle w:val="BodyText"/>
+      </w:pPr>
+      <w:r>
+        <w:rPr>
+          <w:bCs/>
+          <w:b/>
+        </w:rPr>
+        <w:t xml:space="preserve">Se o autor aceitar:</w:t>
+      </w:r>
+      <w:r>
+        <w:t xml:space="preserve"> </w:t>
+      </w:r>
+      <w:r>
+        <w:t xml:space="preserve">pedir a redução a termo dos exatos termos do Anexo e a homologação por sentença (art. 22, parágrafo único, da Lei 9.099/95; art. 487, III,</w:t>
+      </w:r>
+      <w:r>
+        <w:t xml:space="preserve"> </w:t>
+      </w:r>
+      <w:r>
+        <w:t xml:space="preserve">“</w:t>
+      </w:r>
+      <w:r>
+        <w:t xml:space="preserve">b</w:t>
+      </w:r>
+      <w:r>
+        <w:t xml:space="preserve">”</w:t>
+      </w:r>
+      <w:r>
+        <w:t xml:space="preserve"> </w:t>
+      </w:r>
+      <w:r>
+        <w:t xml:space="preserve">e</w:t>
+      </w:r>
+      <w:r>
+        <w:t xml:space="preserve"> </w:t>
+      </w:r>
+      <w:r>
+        <w:t xml:space="preserve">“</w:t>
+      </w:r>
+      <w:r>
+        <w:t xml:space="preserve">c</w:t>
+      </w:r>
+      <w:r>
+        <w:t xml:space="preserve">”</w:t>
+      </w:r>
+      <w:r>
+        <w:t xml:space="preserve">, do CPC).</w:t>
+      </w:r>
+    </w:p>
+    <w:bookmarkEnd w:id="24"/>
+    <w:bookmarkStart w:id="27" w:name="cenário-c-o-juiz-cancela-a-audiência"/>
     <w:p>
       <w:pPr>
         <w:pStyle w:val="Heading2"/>
@@ -1888,7 +2443,7 @@
         <w:t xml:space="preserve">CENÁRIO C — O juiz cancela a audiência</w:t>
       </w:r>
     </w:p>
-    <w:bookmarkStart w:id="24" w:name="X63fbb778c53f124e5e080ce3f94fa6c2e8d6bf4"/>
+    <w:bookmarkStart w:id="25" w:name="X63fbb778c53f124e5e080ce3f94fa6c2e8d6bf4"/>
     <w:p>
       <w:pPr>
         <w:pStyle w:val="Heading3"/>
@@ -2003,8 +2558,8 @@
         <w:t xml:space="preserve">”</w:t>
       </w:r>
     </w:p>
-    <w:bookmarkEnd w:id="24"/>
-    <w:bookmarkStart w:id="25" w:name="Xd4b66d3cd696afd1f17f667564c1aa01ce6012a"/>
+    <w:bookmarkEnd w:id="25"/>
+    <w:bookmarkStart w:id="26" w:name="Xd4b66d3cd696afd1f17f667564c1aa01ce6012a"/>
     <w:p>
       <w:pPr>
         <w:pStyle w:val="Heading3"/>
@@ -2202,9 +2757,31 @@
         <w:t xml:space="preserve">(art. 355, I, do CPC), pela imunidade parlamentar material (art. 29, VIII, CF; Tema 469/STF), já reconhecida na decisão de ID 100909958.</w:t>
       </w:r>
     </w:p>
-    <w:bookmarkEnd w:id="25"/>
+    <w:p>
+      <w:pPr>
+        <w:numPr>
+          <w:ilvl w:val="0"/>
+          <w:numId w:val="1001"/>
+        </w:numPr>
+        <w:pStyle w:val="Compact"/>
+      </w:pPr>
+      <w:r>
+        <w:rPr>
+          <w:bCs/>
+          <w:b/>
+        </w:rPr>
+        <w:t xml:space="preserve">Opcional:</w:t>
+      </w:r>
+      <w:r>
+        <w:t xml:space="preserve"> </w:t>
+      </w:r>
+      <w:r>
+        <w:t xml:space="preserve">protocolar também a Proposta de acordo (Anexo), para registrar a boa-fé do requerido antes da réplica.</w:t>
+      </w:r>
+    </w:p>
     <w:bookmarkEnd w:id="26"/>
-    <w:bookmarkStart w:id="27" w:name="X6ddbc57cd36f29febb9415e2785fb01386765c4"/>
+    <w:bookmarkEnd w:id="27"/>
+    <w:bookmarkStart w:id="28" w:name="X6ddbc57cd36f29febb9415e2785fb01386765c4"/>
     <w:p>
       <w:pPr>
         <w:pStyle w:val="Heading2"/>
@@ -2351,8 +2928,8 @@
         <w:t xml:space="preserve">: ainda que se conte da ciência da citação, a defesa pode ser apresentada até a audiência de instrução, que sequer foi designada. De todo modo, a decisão de ID 100909958 fixou expressamente o art. 231 do CPC como termo inicial. O próprio prazo de 15 dias para contestação escrita não existe na Lei 9.099; é criação do CPC (art. 335) adotada pelo Juízo, e por isso o seu termo inicial segue o sistema do CPC que o Juízo expressamente indicou. Um comando judicial específico, dirigido à parte, prevalece sobre orientação genérica de enunciado. A defesa observou esse marco, em atenção à boa-fé e à proteção da confiança (arts. 5º e 6º do CPC), e, subsidiariamente, há justa causa (art. 223, §§ 1º e 2º, do CPC).”</w:t>
       </w:r>
     </w:p>
-    <w:bookmarkEnd w:id="27"/>
-    <w:bookmarkStart w:id="28" w:name="cuidados-durante-o-ato"/>
+    <w:bookmarkEnd w:id="28"/>
+    <w:bookmarkStart w:id="29" w:name="cuidados-durante-o-ato"/>
     <w:p>
       <w:pPr>
         <w:pStyle w:val="Heading2"/>
@@ -2430,106 +3007,13 @@
           <w:bCs/>
           <w:b/>
         </w:rPr>
-        <w:t xml:space="preserve">Proposta de acordo, por cenário</w:t>
-      </w:r>
-      <w:r>
-        <w:t xml:space="preserve"> </w:t>
-      </w:r>
-      <w:r>
-        <w:t xml:space="preserve">(arquivo</w:t>
-      </w:r>
-      <w:r>
-        <w:t xml:space="preserve"> </w:t>
-      </w:r>
-      <w:r>
-        <w:rPr>
-          <w:iCs/>
-          <w:i/>
-        </w:rPr>
-        <w:t xml:space="preserve">Proposta de acordo - 22-10-2026</w:t>
-      </w:r>
-      <w:r>
-        <w:t xml:space="preserve">):</w:t>
-      </w:r>
-      <w:r>
-        <w:t xml:space="preserve"> </w:t>
-      </w:r>
-      <w:r>
-        <w:rPr>
-          <w:bCs/>
-          <w:b/>
-        </w:rPr>
-        <w:t xml:space="preserve">Cenário A</w:t>
-      </w:r>
-      <w:r>
-        <w:t xml:space="preserve"> </w:t>
-      </w:r>
-      <w:r>
-        <w:t xml:space="preserve">→</w:t>
-      </w:r>
-      <w:r>
-        <w:t xml:space="preserve"> </w:t>
-      </w:r>
-      <w:r>
-        <w:rPr>
-          <w:bCs/>
-          <w:b/>
-        </w:rPr>
-        <w:t xml:space="preserve">não apresentar</w:t>
-      </w:r>
-      <w:r>
-        <w:t xml:space="preserve"> </w:t>
-      </w:r>
-      <w:r>
-        <w:t xml:space="preserve">e justificar (autor ausente, sem procuração, sem interlocutor válido);</w:t>
-      </w:r>
-      <w:r>
-        <w:t xml:space="preserve"> </w:t>
-      </w:r>
-      <w:r>
-        <w:rPr>
-          <w:bCs/>
-          <w:b/>
-        </w:rPr>
-        <w:t xml:space="preserve">Cenário B</w:t>
-      </w:r>
-      <w:r>
-        <w:t xml:space="preserve"> </w:t>
-      </w:r>
-      <w:r>
-        <w:t xml:space="preserve">→</w:t>
-      </w:r>
-      <w:r>
-        <w:t xml:space="preserve"> </w:t>
-      </w:r>
-      <w:r>
-        <w:rPr>
-          <w:bCs/>
-          <w:b/>
-        </w:rPr>
-        <w:t xml:space="preserve">apresentar</w:t>
-      </w:r>
-      <w:r>
-        <w:t xml:space="preserve"> </w:t>
-      </w:r>
-      <w:r>
-        <w:t xml:space="preserve">a proposta e pedir registro em ata;</w:t>
-      </w:r>
-      <w:r>
-        <w:t xml:space="preserve"> </w:t>
-      </w:r>
-      <w:r>
-        <w:rPr>
-          <w:bCs/>
-          <w:b/>
-        </w:rPr>
-        <w:t xml:space="preserve">Cenário C2</w:t>
-      </w:r>
-      <w:r>
-        <w:t xml:space="preserve"> </w:t>
-      </w:r>
-      <w:r>
-        <w:t xml:space="preserve">→ protocolar a proposta é opcional, para registrar boa-fé.</w:t>
+        <w:t xml:space="preserve">Proposta de acordo:</w:t>
+      </w:r>
+      <w:r>
+        <w:t xml:space="preserve"> </w:t>
+      </w:r>
+      <w:r>
+        <w:t xml:space="preserve">só no Cenário B (ver Mapa de decisão). No Cenário A, a justificativa substitui a proposta.</w:t>
       </w:r>
     </w:p>
     <w:p>
@@ -2545,31 +3029,10 @@
           <w:bCs/>
           <w:b/>
         </w:rPr>
-        <w:t xml:space="preserve">Opcional, a critério do cliente:</w:t>
-      </w:r>
-      <w:r>
-        <w:t xml:space="preserve"> </w:t>
-      </w:r>
-      <w:r>
-        <w:t xml:space="preserve">levar uma posição mínima, não confessional (ex.: reconhecer o fato já admitido na contestação, de que o inquérito foi arquivado com reconhecimento da origem lícita do numerário), para esvaziar a tese de que a audiência seria</w:t>
-      </w:r>
-      <w:r>
-        <w:t xml:space="preserve"> </w:t>
-      </w:r>
-      <w:r>
-        <w:t xml:space="preserve">“</w:t>
-      </w:r>
-      <w:r>
-        <w:t xml:space="preserve">pro forma</w:t>
-      </w:r>
-      <w:r>
-        <w:t xml:space="preserve">”</w:t>
-      </w:r>
-      <w:r>
-        <w:t xml:space="preserve"> </w:t>
-      </w:r>
-      <w:r>
-        <w:t xml:space="preserve">sem proposta concreta. Não é retratação.</w:t>
+        <w:t xml:space="preserve">Não discutir mérito com o autor/advogado</w:t>
+      </w:r>
+      <w:r>
+        <w:t xml:space="preserve">; limitar-se ao registro em ata.</w:t>
       </w:r>
     </w:p>
     <w:p>
@@ -2581,25 +3044,6 @@
         <w:pStyle w:val="Compact"/>
       </w:pPr>
       <w:r>
-        <w:rPr>
-          <w:bCs/>
-          <w:b/>
-        </w:rPr>
-        <w:t xml:space="preserve">Não discutir mérito com o autor/advogado</w:t>
-      </w:r>
-      <w:r>
-        <w:t xml:space="preserve">; limitar-se ao registro em ata.</w:t>
-      </w:r>
-    </w:p>
-    <w:p>
-      <w:pPr>
-        <w:numPr>
-          <w:ilvl w:val="0"/>
-          <w:numId w:val="1003"/>
-        </w:numPr>
-        <w:pStyle w:val="Compact"/>
-      </w:pPr>
-      <w:r>
         <w:t xml:space="preserve">Conferir a ata</w:t>
       </w:r>
       <w:r>
@@ -2616,8 +3060,8 @@
         <w:t xml:space="preserve">: ausência do autor (se for o caso), presença pessoal do réu, ratificação da contestação e o pedido de extinção com o fundamento (art. 51, I e § 2º).</w:t>
       </w:r>
     </w:p>
-    <w:bookmarkEnd w:id="28"/>
-    <w:bookmarkStart w:id="29" w:name="cartão-de-citações-para-leitura-rápida"/>
+    <w:bookmarkEnd w:id="29"/>
+    <w:bookmarkStart w:id="30" w:name="cartão-de-citações-para-leitura-rápida"/>
     <w:p>
       <w:pPr>
         <w:pStyle w:val="Heading2"/>
@@ -2927,8 +3371,620 @@
         </w:tc>
       </w:tr>
     </w:tbl>
-    <w:bookmarkEnd w:id="29"/>
+    <w:p>
+      <w:r>
+        <w:br w:type="page"/>
+      </w:r>
+    </w:p>
     <w:bookmarkEnd w:id="30"/>
+    <w:bookmarkEnd w:id="31"/>
+    <w:bookmarkStart w:id="32" w:name="X617a5bd7c20abb19af7b04d5f219220f97a7add"/>
+    <w:p>
+      <w:pPr>
+        <w:pStyle w:val="Heading1"/>
+      </w:pPr>
+      <w:r>
+        <w:t xml:space="preserve">ANEXO — PROPOSTA DE ACORDO (para exibir e juntar no Cenário B)</w:t>
+      </w:r>
+    </w:p>
+    <w:p>
+      <w:pPr>
+        <w:pStyle w:val="FirstParagraph"/>
+      </w:pPr>
+      <w:r>
+        <w:rPr>
+          <w:bCs/>
+          <w:b/>
+        </w:rPr>
+        <w:t xml:space="preserve">EXCELENTÍSSIMO SENHOR DOUTOR JUIZ DE DIREITO DA VARA ÚNICA DA COMARCA DE MIGUEL ALVES — ESTADO DO PIAUÍ</w:t>
+      </w:r>
+    </w:p>
+    <w:p>
+      <w:pPr>
+        <w:pStyle w:val="BodyText"/>
+      </w:pPr>
+      <w:r>
+        <w:rPr>
+          <w:bCs/>
+          <w:b/>
+        </w:rPr>
+        <w:t xml:space="preserve">Processo nº 0800990-83.2026.8.18.0061</w:t>
+      </w:r>
+    </w:p>
+    <w:p>
+      <w:pPr>
+        <w:pStyle w:val="BodyText"/>
+      </w:pPr>
+      <w:r>
+        <w:rPr>
+          <w:bCs/>
+          <w:b/>
+        </w:rPr>
+        <w:t xml:space="preserve">ELY SANDRO VAZ E SILVA</w:t>
+      </w:r>
+      <w:r>
+        <w:t xml:space="preserve">, já qualificado nos autos da ação movida por</w:t>
+      </w:r>
+      <w:r>
+        <w:t xml:space="preserve"> </w:t>
+      </w:r>
+      <w:r>
+        <w:rPr>
+          <w:bCs/>
+          <w:b/>
+        </w:rPr>
+        <w:t xml:space="preserve">FRANCISCO ANTÔNIO REBELO DE PAIVA</w:t>
+      </w:r>
+      <w:r>
+        <w:t xml:space="preserve">, por seu advogado, vem, respeitosamente, à presença de Vossa Excelência, com fundamento nos arts. 2º, 21 e 22 da Lei nº 9.099/1995 e nos arts. 3º, §§ 2º e 3º, e 139, V, do Código de Processo Civil, apresentar</w:t>
+      </w:r>
+    </w:p>
+    <w:bookmarkEnd w:id="32"/>
+    <w:bookmarkStart w:id="36" w:name="proposta-de-acordo"/>
+    <w:p>
+      <w:pPr>
+        <w:pStyle w:val="Heading1"/>
+        <w:jc w:val="center"/>
+      </w:pPr>
+      <w:r>
+        <w:t xml:space="preserve">PROPOSTA DE ACORDO</w:t>
+      </w:r>
+    </w:p>
+    <w:p>
+      <w:pPr>
+        <w:pStyle w:val="FirstParagraph"/>
+      </w:pPr>
+      <w:r>
+        <w:t xml:space="preserve">nos termos a seguir, reafirmando a disposição conciliatória já manifestada na contestação (ID 106243575).</w:t>
+      </w:r>
+    </w:p>
+    <w:bookmarkStart w:id="33" w:name="i.-da-finalidade-da-proposta"/>
+    <w:p>
+      <w:pPr>
+        <w:pStyle w:val="Heading2"/>
+      </w:pPr>
+      <w:r>
+        <w:t xml:space="preserve">I. Da finalidade da proposta</w:t>
+      </w:r>
+    </w:p>
+    <w:p>
+      <w:pPr>
+        <w:pStyle w:val="FirstParagraph"/>
+      </w:pPr>
+      <w:r>
+        <w:t xml:space="preserve">O requerido mantém integralmente as teses de defesa, em especial a incidência da imunidade parlamentar material (art. 29, VIII, da Constituição Federal; Tema 469 do STF), já reconhecida por este Juízo em cognição sumária (ID 100909958). Ainda assim, em atenção ao dever de cooperação e à política judiciária de solução consensual dos conflitos, apresenta proposta</w:t>
+      </w:r>
+      <w:r>
+        <w:t xml:space="preserve"> </w:t>
+      </w:r>
+      <w:r>
+        <w:rPr>
+          <w:bCs/>
+          <w:b/>
+        </w:rPr>
+        <w:t xml:space="preserve">concreta</w:t>
+      </w:r>
+      <w:r>
+        <w:t xml:space="preserve"> </w:t>
+      </w:r>
+      <w:r>
+        <w:t xml:space="preserve">de composição, o que afasta a alegação do autor de que o interesse conciliatório seria</w:t>
+      </w:r>
+      <w:r>
+        <w:t xml:space="preserve"> </w:t>
+      </w:r>
+      <w:r>
+        <w:t xml:space="preserve">“</w:t>
+      </w:r>
+      <w:r>
+        <w:t xml:space="preserve">meramente formal</w:t>
+      </w:r>
+      <w:r>
+        <w:t xml:space="preserve">”</w:t>
+      </w:r>
+      <w:r>
+        <w:t xml:space="preserve"> </w:t>
+      </w:r>
+      <w:r>
+        <w:t xml:space="preserve">e</w:t>
+      </w:r>
+      <w:r>
+        <w:t xml:space="preserve"> </w:t>
+      </w:r>
+      <w:r>
+        <w:t xml:space="preserve">“</w:t>
+      </w:r>
+      <w:r>
+        <w:t xml:space="preserve">desacompanhado de qualquer proposta concreta</w:t>
+      </w:r>
+      <w:r>
+        <w:t xml:space="preserve">”</w:t>
+      </w:r>
+      <w:r>
+        <w:t xml:space="preserve"> </w:t>
+      </w:r>
+      <w:r>
+        <w:t xml:space="preserve">(ID 107306168).</w:t>
+      </w:r>
+    </w:p>
+    <w:bookmarkEnd w:id="33"/>
+    <w:bookmarkStart w:id="34" w:name="ii.-das-condições-propostas"/>
+    <w:p>
+      <w:pPr>
+        <w:pStyle w:val="Heading2"/>
+      </w:pPr>
+      <w:r>
+        <w:t xml:space="preserve">II. Das condições propostas</w:t>
+      </w:r>
+    </w:p>
+    <w:p>
+      <w:pPr>
+        <w:pStyle w:val="FirstParagraph"/>
+      </w:pPr>
+      <w:r>
+        <w:rPr>
+          <w:bCs/>
+          <w:b/>
+        </w:rPr>
+        <w:t xml:space="preserve">Cláusula 1ª — Nota de esclarecimento.</w:t>
+      </w:r>
+      <w:r>
+        <w:t xml:space="preserve"> </w:t>
+      </w:r>
+      <w:r>
+        <w:t xml:space="preserve">O requerido publicará,</w:t>
+      </w:r>
+      <w:r>
+        <w:t xml:space="preserve"> </w:t>
+      </w:r>
+      <w:r>
+        <w:rPr>
+          <w:bCs/>
+          <w:b/>
+        </w:rPr>
+        <w:t xml:space="preserve">uma única vez</w:t>
+      </w:r>
+      <w:r>
+        <w:t xml:space="preserve">, em seu perfil pessoal no Facebook, no prazo de 5 (cinco) dias contados da homologação, mantendo-a publicada por 7 (sete) dias, a seguinte nota, sem acréscimos ou supressões:</w:t>
+      </w:r>
+    </w:p>
+    <w:p>
+      <w:pPr>
+        <w:pStyle w:val="BlockText"/>
+      </w:pPr>
+      <w:r>
+        <w:rPr>
+          <w:iCs/>
+          <w:i/>
+        </w:rPr>
+        <w:t xml:space="preserve">“</w:t>
+      </w:r>
+      <w:r>
+        <w:rPr>
+          <w:iCs/>
+          <w:i/>
+        </w:rPr>
+        <w:t xml:space="preserve">Esclarecimento. Em relação aos pronunciamentos que fiz entre fevereiro e maio de 2026 sobre a quantia apreendida com o Secretário Municipal de Finanças, informo que, por decisão de 24/06/2026, o Juízo da Central de Inquéritos de Teresina arquivou o Inquérito Policial nº 0816146-68.2026.8.18.0140, reconhecendo a origem lícita do valor de R$ 147.300,00 e determinando a sua restituição. Registro essa informação em respeito ao direito de informação da população de Miguel Alves.</w:t>
+      </w:r>
+      <w:r>
+        <w:rPr>
+          <w:iCs/>
+          <w:i/>
+        </w:rPr>
+        <w:t xml:space="preserve">”</w:t>
+      </w:r>
+    </w:p>
+    <w:p>
+      <w:pPr>
+        <w:pStyle w:val="FirstParagraph"/>
+      </w:pPr>
+      <w:r>
+        <w:rPr>
+          <w:bCs/>
+          <w:b/>
+        </w:rPr>
+        <w:t xml:space="preserve">Cláusula 2ª — Ausência de reconhecimento de culpa.</w:t>
+      </w:r>
+      <w:r>
+        <w:t xml:space="preserve"> </w:t>
+      </w:r>
+      <w:r>
+        <w:t xml:space="preserve">A nota tem caráter exclusivamente informativo e reproduz fato objetivo já admitido na contestação. O acordo</w:t>
+      </w:r>
+      <w:r>
+        <w:t xml:space="preserve"> </w:t>
+      </w:r>
+      <w:r>
+        <w:rPr>
+          <w:bCs/>
+          <w:b/>
+        </w:rPr>
+        <w:t xml:space="preserve">não importa reconhecimento</w:t>
+      </w:r>
+      <w:r>
+        <w:t xml:space="preserve"> </w:t>
+      </w:r>
+      <w:r>
+        <w:t xml:space="preserve">de ilicitude, culpa, responsabilidade civil ou penal, nem de inveracidade de qualquer manifestação, e</w:t>
+      </w:r>
+      <w:r>
+        <w:t xml:space="preserve"> </w:t>
+      </w:r>
+      <w:r>
+        <w:rPr>
+          <w:bCs/>
+          <w:b/>
+        </w:rPr>
+        <w:t xml:space="preserve">não implica renúncia</w:t>
+      </w:r>
+      <w:r>
+        <w:t xml:space="preserve"> </w:t>
+      </w:r>
+      <w:r>
+        <w:t xml:space="preserve">à imunidade parlamentar material ou ao exercício da função fiscalizadora inerente ao mandato.</w:t>
+      </w:r>
+    </w:p>
+    <w:p>
+      <w:pPr>
+        <w:pStyle w:val="BodyText"/>
+      </w:pPr>
+      <w:r>
+        <w:rPr>
+          <w:bCs/>
+          <w:b/>
+        </w:rPr>
+        <w:t xml:space="preserve">Cláusula 3ª — Sem obrigações pecuniárias ou de abstenção.</w:t>
+      </w:r>
+      <w:r>
+        <w:t xml:space="preserve"> </w:t>
+      </w:r>
+      <w:r>
+        <w:t xml:space="preserve">Não haverá pagamento de qualquer valor a título de indenização, nem obrigação de remoção de conteúdo ou de abstenção de manifestações futuras.</w:t>
+      </w:r>
+    </w:p>
+    <w:p>
+      <w:pPr>
+        <w:pStyle w:val="BodyText"/>
+      </w:pPr>
+      <w:r>
+        <w:rPr>
+          <w:bCs/>
+          <w:b/>
+        </w:rPr>
+        <w:t xml:space="preserve">Cláusula 4ª — Extinção e quitação.</w:t>
+      </w:r>
+      <w:r>
+        <w:t xml:space="preserve"> </w:t>
+      </w:r>
+      <w:r>
+        <w:t xml:space="preserve">O autor</w:t>
+      </w:r>
+      <w:r>
+        <w:t xml:space="preserve"> </w:t>
+      </w:r>
+      <w:r>
+        <w:rPr>
+          <w:bCs/>
+          <w:b/>
+        </w:rPr>
+        <w:t xml:space="preserve">renuncia ao direito sobre o qual se funda a ação</w:t>
+      </w:r>
+      <w:r>
+        <w:t xml:space="preserve">, requerendo-se a homologação do acordo e a extinção do processo com resolução do mérito (art. 487, III,</w:t>
+      </w:r>
+      <w:r>
+        <w:t xml:space="preserve"> </w:t>
+      </w:r>
+      <w:r>
+        <w:t xml:space="preserve">“</w:t>
+      </w:r>
+      <w:r>
+        <w:t xml:space="preserve">b</w:t>
+      </w:r>
+      <w:r>
+        <w:t xml:space="preserve">”</w:t>
+      </w:r>
+      <w:r>
+        <w:t xml:space="preserve"> </w:t>
+      </w:r>
+      <w:r>
+        <w:t xml:space="preserve">e</w:t>
+      </w:r>
+      <w:r>
+        <w:t xml:space="preserve"> </w:t>
+      </w:r>
+      <w:r>
+        <w:t xml:space="preserve">“</w:t>
+      </w:r>
+      <w:r>
+        <w:t xml:space="preserve">c</w:t>
+      </w:r>
+      <w:r>
+        <w:t xml:space="preserve">”</w:t>
+      </w:r>
+      <w:r>
+        <w:t xml:space="preserve">, do CPC), com</w:t>
+      </w:r>
+      <w:r>
+        <w:t xml:space="preserve"> </w:t>
+      </w:r>
+      <w:r>
+        <w:rPr>
+          <w:bCs/>
+          <w:b/>
+        </w:rPr>
+        <w:t xml:space="preserve">plena, geral e recíproca quitação</w:t>
+      </w:r>
+      <w:r>
+        <w:t xml:space="preserve"> </w:t>
+      </w:r>
+      <w:r>
+        <w:t xml:space="preserve">quanto aos fatos narrados na inicial.</w:t>
+      </w:r>
+    </w:p>
+    <w:p>
+      <w:pPr>
+        <w:pStyle w:val="BodyText"/>
+      </w:pPr>
+      <w:r>
+        <w:rPr>
+          <w:bCs/>
+          <w:b/>
+        </w:rPr>
+        <w:t xml:space="preserve">Cláusula 5ª — Custas e honorários.</w:t>
+      </w:r>
+      <w:r>
+        <w:t xml:space="preserve"> </w:t>
+      </w:r>
+      <w:r>
+        <w:t xml:space="preserve">Cada parte arcará com os honorários de seu advogado. Sem custas, nos termos do art. 54 da Lei nº 9.099/1995.</w:t>
+      </w:r>
+    </w:p>
+    <w:p>
+      <w:pPr>
+        <w:pStyle w:val="BodyText"/>
+      </w:pPr>
+      <w:r>
+        <w:rPr>
+          <w:bCs/>
+          <w:b/>
+        </w:rPr>
+        <w:t xml:space="preserve">Cláusula 6ª — Queixa-crime.</w:t>
+      </w:r>
+      <w:r>
+        <w:t xml:space="preserve"> </w:t>
+      </w:r>
+      <w:r>
+        <w:t xml:space="preserve">[OPCIONAL — confirmar com o cliente] Considerando que os mesmos fatos são objeto da Queixa-Crime nº 0800876-47.2026.8.18.0061, em trâmite neste Juízo, o querelante concede</w:t>
+      </w:r>
+      <w:r>
+        <w:t xml:space="preserve"> </w:t>
+      </w:r>
+      <w:r>
+        <w:rPr>
+          <w:bCs/>
+          <w:b/>
+        </w:rPr>
+        <w:t xml:space="preserve">perdão</w:t>
+      </w:r>
+      <w:r>
+        <w:t xml:space="preserve"> </w:t>
+      </w:r>
+      <w:r>
+        <w:t xml:space="preserve">ao querelado, para os fins dos arts. 105 e 107, V, do Código Penal, comprometendo-se a requerer a extinção da punibilidade naqueles autos no prazo de 5 (cinco) dias da homologação.</w:t>
+      </w:r>
+    </w:p>
+    <w:p>
+      <w:pPr>
+        <w:pStyle w:val="BodyText"/>
+      </w:pPr>
+      <w:r>
+        <w:rPr>
+          <w:bCs/>
+          <w:b/>
+        </w:rPr>
+        <w:t xml:space="preserve">Cláusula 7ª — Descumprimento.</w:t>
+      </w:r>
+      <w:r>
+        <w:t xml:space="preserve"> </w:t>
+      </w:r>
+      <w:r>
+        <w:t xml:space="preserve">O descumprimento da Cláusula 1ª autoriza a execução da obrigação de fazer nos próprios autos (art. 52, V, da Lei nº 9.099/1995).</w:t>
+      </w:r>
+    </w:p>
+    <w:bookmarkEnd w:id="34"/>
+    <w:bookmarkStart w:id="35" w:name="iii.-dos-requerimentos"/>
+    <w:p>
+      <w:pPr>
+        <w:pStyle w:val="Heading2"/>
+      </w:pPr>
+      <w:r>
+        <w:t xml:space="preserve">III. Dos requerimentos</w:t>
+      </w:r>
+    </w:p>
+    <w:p>
+      <w:pPr>
+        <w:pStyle w:val="FirstParagraph"/>
+      </w:pPr>
+      <w:r>
+        <w:t xml:space="preserve">Ante o exposto, requer:</w:t>
+      </w:r>
+    </w:p>
+    <w:p>
+      <w:pPr>
+        <w:numPr>
+          <w:ilvl w:val="0"/>
+          <w:numId w:val="1004"/>
+        </w:numPr>
+        <w:pStyle w:val="Compact"/>
+      </w:pPr>
+      <w:r>
+        <w:t xml:space="preserve">o</w:t>
+      </w:r>
+      <w:r>
+        <w:t xml:space="preserve"> </w:t>
+      </w:r>
+      <w:r>
+        <w:rPr>
+          <w:bCs/>
+          <w:b/>
+        </w:rPr>
+        <w:t xml:space="preserve">registro desta proposta</w:t>
+      </w:r>
+      <w:r>
+        <w:t xml:space="preserve"> </w:t>
+      </w:r>
+      <w:r>
+        <w:t xml:space="preserve">nos autos e em ata;</w:t>
+      </w:r>
+    </w:p>
+    <w:p>
+      <w:pPr>
+        <w:numPr>
+          <w:ilvl w:val="0"/>
+          <w:numId w:val="1004"/>
+        </w:numPr>
+        <w:pStyle w:val="Compact"/>
+      </w:pPr>
+      <w:r>
+        <w:t xml:space="preserve">a</w:t>
+      </w:r>
+      <w:r>
+        <w:t xml:space="preserve"> </w:t>
+      </w:r>
+      <w:r>
+        <w:rPr>
+          <w:bCs/>
+          <w:b/>
+        </w:rPr>
+        <w:t xml:space="preserve">intimação do autor</w:t>
+      </w:r>
+      <w:r>
+        <w:t xml:space="preserve"> </w:t>
+      </w:r>
+      <w:r>
+        <w:t xml:space="preserve">para que se manifeste sobre ela;</w:t>
+      </w:r>
+    </w:p>
+    <w:p>
+      <w:pPr>
+        <w:numPr>
+          <w:ilvl w:val="0"/>
+          <w:numId w:val="1004"/>
+        </w:numPr>
+        <w:pStyle w:val="Compact"/>
+      </w:pPr>
+      <w:r>
+        <w:t xml:space="preserve">em caso de aceitação, a</w:t>
+      </w:r>
+      <w:r>
+        <w:t xml:space="preserve"> </w:t>
+      </w:r>
+      <w:r>
+        <w:rPr>
+          <w:bCs/>
+          <w:b/>
+        </w:rPr>
+        <w:t xml:space="preserve">homologação do acordo</w:t>
+      </w:r>
+      <w:r>
+        <w:t xml:space="preserve"> </w:t>
+      </w:r>
+      <w:r>
+        <w:t xml:space="preserve">por sentença, com resolução do mérito (art. 22, parágrafo único, da Lei nº 9.099/1995; art. 487, III, do CPC);</w:t>
+      </w:r>
+    </w:p>
+    <w:p>
+      <w:pPr>
+        <w:numPr>
+          <w:ilvl w:val="0"/>
+          <w:numId w:val="1004"/>
+        </w:numPr>
+        <w:pStyle w:val="Compact"/>
+      </w:pPr>
+      <w:r>
+        <w:t xml:space="preserve">em caso de recusa, o</w:t>
+      </w:r>
+      <w:r>
+        <w:t xml:space="preserve"> </w:t>
+      </w:r>
+      <w:r>
+        <w:rPr>
+          <w:bCs/>
+          <w:b/>
+        </w:rPr>
+        <w:t xml:space="preserve">registro de que a composição foi inviabilizada pelo autor</w:t>
+      </w:r>
+      <w:r>
+        <w:t xml:space="preserve"> </w:t>
+      </w:r>
+      <w:r>
+        <w:t xml:space="preserve">e o regular prosseguimento do feito, com o julgamento antecipado do mérito (art. 355, I, do CPC).</w:t>
+      </w:r>
+    </w:p>
+    <w:p>
+      <w:pPr>
+        <w:pStyle w:val="FirstParagraph"/>
+        <w:jc w:val="center"/>
+      </w:pPr>
+      <w:r>
+        <w:t xml:space="preserve">Nestes termos, pede deferimento.</w:t>
+      </w:r>
+    </w:p>
+    <w:p>
+      <w:pPr>
+        <w:pStyle w:val="BodyText"/>
+        <w:jc w:val="center"/>
+      </w:pPr>
+      <w:r>
+        <w:t xml:space="preserve">Miguel Alves/PI, 22 de outubro de 2026.</w:t>
+      </w:r>
+    </w:p>
+    <w:p>
+      <w:pPr>
+        <w:pStyle w:val="BodyText"/>
+        <w:jc w:val="center"/>
+      </w:pPr>
+      <w:r>
+        <w:rPr>
+          <w:bCs/>
+          <w:b/>
+        </w:rPr>
+        <w:t xml:space="preserve">ANTÔNIO DE PÁDUA SANTOS NETO</w:t>
+      </w:r>
+      <w:r>
+        <w:br/>
+      </w:r>
+      <w:r>
+        <w:rPr>
+          <w:bCs/>
+          <w:b/>
+        </w:rPr>
+        <w:t xml:space="preserve">OAB/PI nº 21.320</w:t>
+      </w:r>
+    </w:p>
+    <w:bookmarkEnd w:id="35"/>
+    <w:bookmarkEnd w:id="36"/>
     <w:sectPr>
       <w:pgSz w:h="16838" w:w="11906"/>
       <w:pgMar w:bottom="1134" w:footer="567" w:gutter="0" w:header="567" w:left="1418" w:right="1134" w:top="1134"/>
@@ -3237,6 +4293,36 @@
   </w:num>
   <w:num w:numId="1003">
     <w:abstractNumId w:val="991"/>
+  </w:num>
+  <w:num w:numId="1004">
+    <w:abstractNumId w:val="99411"/>
+    <w:lvlOverride w:ilvl="0">
+      <w:startOverride w:val="1"/>
+    </w:lvlOverride>
+    <w:lvlOverride w:ilvl="1">
+      <w:startOverride w:val="1"/>
+    </w:lvlOverride>
+    <w:lvlOverride w:ilvl="2">
+      <w:startOverride w:val="1"/>
+    </w:lvlOverride>
+    <w:lvlOverride w:ilvl="3">
+      <w:startOverride w:val="1"/>
+    </w:lvlOverride>
+    <w:lvlOverride w:ilvl="4">
+      <w:startOverride w:val="1"/>
+    </w:lvlOverride>
+    <w:lvlOverride w:ilvl="5">
+      <w:startOverride w:val="1"/>
+    </w:lvlOverride>
+    <w:lvlOverride w:ilvl="6">
+      <w:startOverride w:val="1"/>
+    </w:lvlOverride>
+    <w:lvlOverride w:ilvl="7">
+      <w:startOverride w:val="1"/>
+    </w:lvlOverride>
+    <w:lvlOverride w:ilvl="8">
+      <w:startOverride w:val="1"/>
+    </w:lvlOverride>
   </w:num>
 </w:numbering>
 </file>

</xml_diff>

<commit_message>
Roteiro: sem proposta de acordo também no Cenário B (recusa expressa do autor); anexo removido
Co-Authored-By: Claude Opus 5.5 <noreply@anthropic.com>
Claude-Session: https://claude.ai/code/session_01CUmiv8ZKDC5VxLQ3BigcLo
</commit_message>
<xml_diff>
--- a/0800990-83.2026 - Ely Sandro/Pedido oral - audiência de conciliação 22-10-2026.docx
+++ b/0800990-83.2026 - Ely Sandro/Pedido oral - audiência de conciliação 22-10-2026.docx
@@ -160,7 +160,7 @@
               <w:jc w:val="left"/>
             </w:pPr>
             <w:r>
-              <w:t xml:space="preserve">Protocolo opcional, para registrar boa-fé</w:t>
+              <w:t xml:space="preserve">Não apresentar</w:t>
             </w:r>
           </w:p>
         </w:tc>
@@ -318,13 +318,13 @@
                 <w:bCs/>
                 <w:b/>
               </w:rPr>
-              <w:t xml:space="preserve">Apresentar</w:t>
+              <w:t xml:space="preserve">Não apresentar</w:t>
             </w:r>
             <w:r>
               <w:t xml:space="preserve"> </w:t>
             </w:r>
             <w:r>
-              <w:t xml:space="preserve">(Anexo)</w:t>
+              <w:t xml:space="preserve">e justificar (recusa expressa do autor)</w:t>
             </w:r>
           </w:p>
         </w:tc>
@@ -546,60 +546,20 @@
         <w:pStyle w:val="BodyText"/>
       </w:pPr>
       <w:r>
-        <w:t xml:space="preserve">☐</w:t>
-      </w:r>
-      <w:r>
-        <w:t xml:space="preserve"> </w:t>
-      </w:r>
-      <w:r>
-        <w:rPr>
-          <w:bCs/>
-          <w:b/>
-        </w:rPr>
-        <w:t xml:space="preserve">Proposta de acordo:</w:t>
-      </w:r>
-      <w:r>
-        <w:t xml:space="preserve"> </w:t>
-      </w:r>
-      <w:r>
-        <w:t xml:space="preserve">autorização do Ely Sandro para os termos do Anexo (em especial a nota e a Cláusula 6ª) e procuração dele (ID 105179160)</w:t>
-      </w:r>
-      <w:r>
-        <w:t xml:space="preserve"> </w:t>
-      </w:r>
-      <w:r>
-        <w:rPr>
-          <w:bCs/>
-          <w:b/>
-        </w:rPr>
-        <w:t xml:space="preserve">com poderes para transigir</w:t>
-      </w:r>
-      <w:r>
-        <w:t xml:space="preserve">. Sem esses dois itens, não apresentar a proposta.</w:t>
-      </w:r>
-    </w:p>
-    <w:p>
-      <w:pPr>
-        <w:pStyle w:val="BodyText"/>
-      </w:pPr>
-      <w:r>
-        <w:t xml:space="preserve">☐ Ter impressa a</w:t>
-      </w:r>
-      <w:r>
-        <w:t xml:space="preserve"> </w:t>
-      </w:r>
-      <w:r>
-        <w:rPr>
-          <w:bCs/>
-          <w:b/>
-        </w:rPr>
-        <w:t xml:space="preserve">Proposta de acordo</w:t>
-      </w:r>
-      <w:r>
-        <w:t xml:space="preserve"> </w:t>
-      </w:r>
-      <w:r>
-        <w:t xml:space="preserve">(Anexo) para exibir no Cenário B.</w:t>
+        <w:t xml:space="preserve">☐ Se surgir proposta do autor: lembrar que só o cliente decide; conferir se a procuração do Ely Sandro (ID 105179160) tem</w:t>
+      </w:r>
+      <w:r>
+        <w:t xml:space="preserve"> </w:t>
+      </w:r>
+      <w:r>
+        <w:rPr>
+          <w:bCs/>
+          <w:b/>
+        </w:rPr>
+        <w:t xml:space="preserve">poderes para transigir</w:t>
+      </w:r>
+      <w:r>
+        <w:t xml:space="preserve">.</w:t>
       </w:r>
     </w:p>
     <w:bookmarkEnd w:id="21"/>
@@ -2155,97 +2115,77 @@
         <w:pStyle w:val="BlockText"/>
       </w:pPr>
       <w:r>
-        <w:t xml:space="preserve">Em demonstração de efetiva disposição conciliatória, o requerido apresenta, neste ato,</w:t>
-      </w:r>
-      <w:r>
-        <w:t xml:space="preserve"> </w:t>
-      </w:r>
-      <w:r>
-        <w:rPr>
-          <w:bCs/>
-          <w:b/>
-        </w:rPr>
-        <w:t xml:space="preserve">proposta concreta de acordo</w:t>
-      </w:r>
-      <w:r>
-        <w:t xml:space="preserve">, nos seguintes termos: (i) o requerido publicará, uma única vez, em seu perfil no Facebook,</w:t>
-      </w:r>
-      <w:r>
-        <w:t xml:space="preserve"> </w:t>
-      </w:r>
-      <w:r>
-        <w:rPr>
-          <w:bCs/>
-          <w:b/>
-        </w:rPr>
-        <w:t xml:space="preserve">nota de esclarecimento</w:t>
-      </w:r>
-      <w:r>
-        <w:t xml:space="preserve"> </w:t>
-      </w:r>
-      <w:r>
-        <w:t xml:space="preserve">informando que o Inquérito Policial nº 0816146-68.2026.8.18.0140 foi arquivado por decisão de 24/06/2026, com reconhecimento da origem lícita do valor de R$ 147.300,00, mantendo-a por 7 dias; (ii)</w:t>
-      </w:r>
-      <w:r>
-        <w:t xml:space="preserve"> </w:t>
-      </w:r>
-      <w:r>
-        <w:rPr>
-          <w:bCs/>
-          <w:b/>
-        </w:rPr>
-        <w:t xml:space="preserve">sem pagamento</w:t>
-      </w:r>
-      <w:r>
-        <w:t xml:space="preserve"> </w:t>
-      </w:r>
-      <w:r>
-        <w:t xml:space="preserve">de qualquer valor, sem remoção de conteúdo e sem obrigação de abstenção; (iii)</w:t>
-      </w:r>
-      <w:r>
-        <w:t xml:space="preserve"> </w:t>
-      </w:r>
-      <w:r>
-        <w:rPr>
-          <w:bCs/>
-          <w:b/>
-        </w:rPr>
-        <w:t xml:space="preserve">sem reconhecimento</w:t>
-      </w:r>
-      <w:r>
-        <w:t xml:space="preserve"> </w:t>
-      </w:r>
-      <w:r>
-        <w:t xml:space="preserve">de ilicitude, culpa ou inveracidade e sem renúncia à imunidade parlamentar; (iv) o autor</w:t>
-      </w:r>
-      <w:r>
-        <w:t xml:space="preserve"> </w:t>
-      </w:r>
-      <w:r>
-        <w:rPr>
-          <w:bCs/>
-          <w:b/>
-        </w:rPr>
-        <w:t xml:space="preserve">renuncia ao direito</w:t>
-      </w:r>
-      <w:r>
-        <w:t xml:space="preserve"> </w:t>
-      </w:r>
-      <w:r>
-        <w:t xml:space="preserve">em que se funda a ação, com extinção do processo com resolução do mérito e</w:t>
-      </w:r>
-      <w:r>
-        <w:t xml:space="preserve"> </w:t>
-      </w:r>
-      <w:r>
-        <w:rPr>
-          <w:bCs/>
-          <w:b/>
-        </w:rPr>
-        <w:t xml:space="preserve">quitação recíproca</w:t>
-      </w:r>
-      <w:r>
-        <w:t xml:space="preserve">; (v) cada parte arca com os honorários de seu advogado. Requer que a proposta conste em ata, com a juntada da petição escrita, e que o autor se manifeste.</w:t>
+        <w:t xml:space="preserve">O requerido</w:t>
+      </w:r>
+      <w:r>
+        <w:t xml:space="preserve"> </w:t>
+      </w:r>
+      <w:r>
+        <w:rPr>
+          <w:bCs/>
+          <w:b/>
+        </w:rPr>
+        <w:t xml:space="preserve">deixa de apresentar proposta de acordo</w:t>
+      </w:r>
+      <w:r>
+        <w:t xml:space="preserve">, sem prejuízo da disposição conciliatória que mantém, porque o próprio autor declarou nos autos, de forma</w:t>
+      </w:r>
+      <w:r>
+        <w:t xml:space="preserve"> </w:t>
+      </w:r>
+      <w:r>
+        <w:rPr>
+          <w:bCs/>
+          <w:b/>
+        </w:rPr>
+        <w:t xml:space="preserve">expressa e inequívoca</w:t>
+      </w:r>
+      <w:r>
+        <w:t xml:space="preserve">, que</w:t>
+      </w:r>
+      <w:r>
+        <w:t xml:space="preserve"> </w:t>
+      </w:r>
+      <w:r>
+        <w:rPr>
+          <w:bCs/>
+          <w:b/>
+        </w:rPr>
+        <w:t xml:space="preserve">não tem interesse na autocomposição</w:t>
+      </w:r>
+      <w:r>
+        <w:t xml:space="preserve"> </w:t>
+      </w:r>
+      <w:r>
+        <w:t xml:space="preserve">(ID 107306168) e que a retratação é o núcleo da sua pretensão, afirmando que</w:t>
+      </w:r>
+      <w:r>
+        <w:t xml:space="preserve"> </w:t>
+      </w:r>
+      <w:r>
+        <w:t xml:space="preserve">“</w:t>
+      </w:r>
+      <w:r>
+        <w:t xml:space="preserve">inexiste ponto de convergência possível</w:t>
+      </w:r>
+      <w:r>
+        <w:t xml:space="preserve">”</w:t>
+      </w:r>
+      <w:r>
+        <w:t xml:space="preserve">. A autocomposição é ato bilateral e voluntário, como o próprio autor sustentou na sua petição (art. 166 do CPC; art. 2º, § 2º, da Lei 13.140/2015). Diante da recusa prévia e expressa, qualquer proposta seria inócua. A inviabilidade da composição decorre, portanto,</w:t>
+      </w:r>
+      <w:r>
+        <w:t xml:space="preserve"> </w:t>
+      </w:r>
+      <w:r>
+        <w:rPr>
+          <w:bCs/>
+          <w:b/>
+        </w:rPr>
+        <w:t xml:space="preserve">exclusivamente da manifestação do autor</w:t>
+      </w:r>
+      <w:r>
+        <w:t xml:space="preserve">, e não do requerido, que compareceu pessoalmente e permanece aberto ao diálogo, inclusive em momento posterior (art. 139, V, do CPC).</w:t>
       </w:r>
     </w:p>
     <w:p>
@@ -2357,7 +2297,7 @@
           <w:bCs/>
           <w:b/>
         </w:rPr>
-        <w:t xml:space="preserve">Se o autor fizer contraproposta:</w:t>
+        <w:t xml:space="preserve">Se o autor fizer proposta:</w:t>
       </w:r>
       <w:r>
         <w:t xml:space="preserve"> </w:t>
@@ -2380,57 +2320,6 @@
       </w:r>
       <w:r>
         <w:t xml:space="preserve">retratação genérica, pagamento, remoção de vídeos ou abstenção de manifestações futuras sem autorização expressa do cliente.</w:t>
-      </w:r>
-    </w:p>
-    <w:p>
-      <w:pPr>
-        <w:pStyle w:val="BodyText"/>
-      </w:pPr>
-      <w:r>
-        <w:rPr>
-          <w:bCs/>
-          <w:b/>
-        </w:rPr>
-        <w:t xml:space="preserve">Se o autor aceitar:</w:t>
-      </w:r>
-      <w:r>
-        <w:t xml:space="preserve"> </w:t>
-      </w:r>
-      <w:r>
-        <w:t xml:space="preserve">pedir a redução a termo dos exatos termos do Anexo e a homologação por sentença (art. 22, parágrafo único, da Lei 9.099/95; art. 487, III,</w:t>
-      </w:r>
-      <w:r>
-        <w:t xml:space="preserve"> </w:t>
-      </w:r>
-      <w:r>
-        <w:t xml:space="preserve">“</w:t>
-      </w:r>
-      <w:r>
-        <w:t xml:space="preserve">b</w:t>
-      </w:r>
-      <w:r>
-        <w:t xml:space="preserve">”</w:t>
-      </w:r>
-      <w:r>
-        <w:t xml:space="preserve"> </w:t>
-      </w:r>
-      <w:r>
-        <w:t xml:space="preserve">e</w:t>
-      </w:r>
-      <w:r>
-        <w:t xml:space="preserve"> </w:t>
-      </w:r>
-      <w:r>
-        <w:t xml:space="preserve">“</w:t>
-      </w:r>
-      <w:r>
-        <w:t xml:space="preserve">c</w:t>
-      </w:r>
-      <w:r>
-        <w:t xml:space="preserve">”</w:t>
-      </w:r>
-      <w:r>
-        <w:t xml:space="preserve">, do CPC).</w:t>
       </w:r>
     </w:p>
     <w:bookmarkEnd w:id="24"/>
@@ -2757,28 +2646,6 @@
         <w:t xml:space="preserve">(art. 355, I, do CPC), pela imunidade parlamentar material (art. 29, VIII, CF; Tema 469/STF), já reconhecida na decisão de ID 100909958.</w:t>
       </w:r>
     </w:p>
-    <w:p>
-      <w:pPr>
-        <w:numPr>
-          <w:ilvl w:val="0"/>
-          <w:numId w:val="1001"/>
-        </w:numPr>
-        <w:pStyle w:val="Compact"/>
-      </w:pPr>
-      <w:r>
-        <w:rPr>
-          <w:bCs/>
-          <w:b/>
-        </w:rPr>
-        <w:t xml:space="preserve">Opcional:</w:t>
-      </w:r>
-      <w:r>
-        <w:t xml:space="preserve"> </w:t>
-      </w:r>
-      <w:r>
-        <w:t xml:space="preserve">protocolar também a Proposta de acordo (Anexo), para registrar a boa-fé do requerido antes da réplica.</w:t>
-      </w:r>
-    </w:p>
     <w:bookmarkEnd w:id="26"/>
     <w:bookmarkEnd w:id="27"/>
     <w:bookmarkStart w:id="28" w:name="X6ddbc57cd36f29febb9415e2785fb01386765c4"/>
@@ -3013,7 +2880,23 @@
         <w:t xml:space="preserve"> </w:t>
       </w:r>
       <w:r>
-        <w:t xml:space="preserve">só no Cenário B (ver Mapa de decisão). No Cenário A, a justificativa substitui a proposta.</w:t>
+        <w:t xml:space="preserve">o requerido</w:t>
+      </w:r>
+      <w:r>
+        <w:t xml:space="preserve"> </w:t>
+      </w:r>
+      <w:r>
+        <w:rPr>
+          <w:bCs/>
+          <w:b/>
+        </w:rPr>
+        <w:t xml:space="preserve">não apresenta proposta</w:t>
+      </w:r>
+      <w:r>
+        <w:t xml:space="preserve"> </w:t>
+      </w:r>
+      <w:r>
+        <w:t xml:space="preserve">em nenhum cenário. No Cenário A, por falta de interlocutor válido (autor ausente, sem procuração); no Cenário B, pela recusa expressa do autor (ID 107306168). Em ambos, registrar que a disposição conciliatória do requerido permanece.</w:t>
       </w:r>
     </w:p>
     <w:p>
@@ -3371,620 +3254,8 @@
         </w:tc>
       </w:tr>
     </w:tbl>
-    <w:p>
-      <w:r>
-        <w:br w:type="page"/>
-      </w:r>
-    </w:p>
     <w:bookmarkEnd w:id="30"/>
     <w:bookmarkEnd w:id="31"/>
-    <w:bookmarkStart w:id="32" w:name="X617a5bd7c20abb19af7b04d5f219220f97a7add"/>
-    <w:p>
-      <w:pPr>
-        <w:pStyle w:val="Heading1"/>
-      </w:pPr>
-      <w:r>
-        <w:t xml:space="preserve">ANEXO — PROPOSTA DE ACORDO (para exibir e juntar no Cenário B)</w:t>
-      </w:r>
-    </w:p>
-    <w:p>
-      <w:pPr>
-        <w:pStyle w:val="FirstParagraph"/>
-      </w:pPr>
-      <w:r>
-        <w:rPr>
-          <w:bCs/>
-          <w:b/>
-        </w:rPr>
-        <w:t xml:space="preserve">EXCELENTÍSSIMO SENHOR DOUTOR JUIZ DE DIREITO DA VARA ÚNICA DA COMARCA DE MIGUEL ALVES — ESTADO DO PIAUÍ</w:t>
-      </w:r>
-    </w:p>
-    <w:p>
-      <w:pPr>
-        <w:pStyle w:val="BodyText"/>
-      </w:pPr>
-      <w:r>
-        <w:rPr>
-          <w:bCs/>
-          <w:b/>
-        </w:rPr>
-        <w:t xml:space="preserve">Processo nº 0800990-83.2026.8.18.0061</w:t>
-      </w:r>
-    </w:p>
-    <w:p>
-      <w:pPr>
-        <w:pStyle w:val="BodyText"/>
-      </w:pPr>
-      <w:r>
-        <w:rPr>
-          <w:bCs/>
-          <w:b/>
-        </w:rPr>
-        <w:t xml:space="preserve">ELY SANDRO VAZ E SILVA</w:t>
-      </w:r>
-      <w:r>
-        <w:t xml:space="preserve">, já qualificado nos autos da ação movida por</w:t>
-      </w:r>
-      <w:r>
-        <w:t xml:space="preserve"> </w:t>
-      </w:r>
-      <w:r>
-        <w:rPr>
-          <w:bCs/>
-          <w:b/>
-        </w:rPr>
-        <w:t xml:space="preserve">FRANCISCO ANTÔNIO REBELO DE PAIVA</w:t>
-      </w:r>
-      <w:r>
-        <w:t xml:space="preserve">, por seu advogado, vem, respeitosamente, à presença de Vossa Excelência, com fundamento nos arts. 2º, 21 e 22 da Lei nº 9.099/1995 e nos arts. 3º, §§ 2º e 3º, e 139, V, do Código de Processo Civil, apresentar</w:t>
-      </w:r>
-    </w:p>
-    <w:bookmarkEnd w:id="32"/>
-    <w:bookmarkStart w:id="36" w:name="proposta-de-acordo"/>
-    <w:p>
-      <w:pPr>
-        <w:pStyle w:val="Heading1"/>
-        <w:jc w:val="center"/>
-      </w:pPr>
-      <w:r>
-        <w:t xml:space="preserve">PROPOSTA DE ACORDO</w:t>
-      </w:r>
-    </w:p>
-    <w:p>
-      <w:pPr>
-        <w:pStyle w:val="FirstParagraph"/>
-      </w:pPr>
-      <w:r>
-        <w:t xml:space="preserve">nos termos a seguir, reafirmando a disposição conciliatória já manifestada na contestação (ID 106243575).</w:t>
-      </w:r>
-    </w:p>
-    <w:bookmarkStart w:id="33" w:name="i.-da-finalidade-da-proposta"/>
-    <w:p>
-      <w:pPr>
-        <w:pStyle w:val="Heading2"/>
-      </w:pPr>
-      <w:r>
-        <w:t xml:space="preserve">I. Da finalidade da proposta</w:t>
-      </w:r>
-    </w:p>
-    <w:p>
-      <w:pPr>
-        <w:pStyle w:val="FirstParagraph"/>
-      </w:pPr>
-      <w:r>
-        <w:t xml:space="preserve">O requerido mantém integralmente as teses de defesa, em especial a incidência da imunidade parlamentar material (art. 29, VIII, da Constituição Federal; Tema 469 do STF), já reconhecida por este Juízo em cognição sumária (ID 100909958). Ainda assim, em atenção ao dever de cooperação e à política judiciária de solução consensual dos conflitos, apresenta proposta</w:t>
-      </w:r>
-      <w:r>
-        <w:t xml:space="preserve"> </w:t>
-      </w:r>
-      <w:r>
-        <w:rPr>
-          <w:bCs/>
-          <w:b/>
-        </w:rPr>
-        <w:t xml:space="preserve">concreta</w:t>
-      </w:r>
-      <w:r>
-        <w:t xml:space="preserve"> </w:t>
-      </w:r>
-      <w:r>
-        <w:t xml:space="preserve">de composição, o que afasta a alegação do autor de que o interesse conciliatório seria</w:t>
-      </w:r>
-      <w:r>
-        <w:t xml:space="preserve"> </w:t>
-      </w:r>
-      <w:r>
-        <w:t xml:space="preserve">“</w:t>
-      </w:r>
-      <w:r>
-        <w:t xml:space="preserve">meramente formal</w:t>
-      </w:r>
-      <w:r>
-        <w:t xml:space="preserve">”</w:t>
-      </w:r>
-      <w:r>
-        <w:t xml:space="preserve"> </w:t>
-      </w:r>
-      <w:r>
-        <w:t xml:space="preserve">e</w:t>
-      </w:r>
-      <w:r>
-        <w:t xml:space="preserve"> </w:t>
-      </w:r>
-      <w:r>
-        <w:t xml:space="preserve">“</w:t>
-      </w:r>
-      <w:r>
-        <w:t xml:space="preserve">desacompanhado de qualquer proposta concreta</w:t>
-      </w:r>
-      <w:r>
-        <w:t xml:space="preserve">”</w:t>
-      </w:r>
-      <w:r>
-        <w:t xml:space="preserve"> </w:t>
-      </w:r>
-      <w:r>
-        <w:t xml:space="preserve">(ID 107306168).</w:t>
-      </w:r>
-    </w:p>
-    <w:bookmarkEnd w:id="33"/>
-    <w:bookmarkStart w:id="34" w:name="ii.-das-condições-propostas"/>
-    <w:p>
-      <w:pPr>
-        <w:pStyle w:val="Heading2"/>
-      </w:pPr>
-      <w:r>
-        <w:t xml:space="preserve">II. Das condições propostas</w:t>
-      </w:r>
-    </w:p>
-    <w:p>
-      <w:pPr>
-        <w:pStyle w:val="FirstParagraph"/>
-      </w:pPr>
-      <w:r>
-        <w:rPr>
-          <w:bCs/>
-          <w:b/>
-        </w:rPr>
-        <w:t xml:space="preserve">Cláusula 1ª — Nota de esclarecimento.</w:t>
-      </w:r>
-      <w:r>
-        <w:t xml:space="preserve"> </w:t>
-      </w:r>
-      <w:r>
-        <w:t xml:space="preserve">O requerido publicará,</w:t>
-      </w:r>
-      <w:r>
-        <w:t xml:space="preserve"> </w:t>
-      </w:r>
-      <w:r>
-        <w:rPr>
-          <w:bCs/>
-          <w:b/>
-        </w:rPr>
-        <w:t xml:space="preserve">uma única vez</w:t>
-      </w:r>
-      <w:r>
-        <w:t xml:space="preserve">, em seu perfil pessoal no Facebook, no prazo de 5 (cinco) dias contados da homologação, mantendo-a publicada por 7 (sete) dias, a seguinte nota, sem acréscimos ou supressões:</w:t>
-      </w:r>
-    </w:p>
-    <w:p>
-      <w:pPr>
-        <w:pStyle w:val="BlockText"/>
-      </w:pPr>
-      <w:r>
-        <w:rPr>
-          <w:iCs/>
-          <w:i/>
-        </w:rPr>
-        <w:t xml:space="preserve">“</w:t>
-      </w:r>
-      <w:r>
-        <w:rPr>
-          <w:iCs/>
-          <w:i/>
-        </w:rPr>
-        <w:t xml:space="preserve">Esclarecimento. Em relação aos pronunciamentos que fiz entre fevereiro e maio de 2026 sobre a quantia apreendida com o Secretário Municipal de Finanças, informo que, por decisão de 24/06/2026, o Juízo da Central de Inquéritos de Teresina arquivou o Inquérito Policial nº 0816146-68.2026.8.18.0140, reconhecendo a origem lícita do valor de R$ 147.300,00 e determinando a sua restituição. Registro essa informação em respeito ao direito de informação da população de Miguel Alves.</w:t>
-      </w:r>
-      <w:r>
-        <w:rPr>
-          <w:iCs/>
-          <w:i/>
-        </w:rPr>
-        <w:t xml:space="preserve">”</w:t>
-      </w:r>
-    </w:p>
-    <w:p>
-      <w:pPr>
-        <w:pStyle w:val="FirstParagraph"/>
-      </w:pPr>
-      <w:r>
-        <w:rPr>
-          <w:bCs/>
-          <w:b/>
-        </w:rPr>
-        <w:t xml:space="preserve">Cláusula 2ª — Ausência de reconhecimento de culpa.</w:t>
-      </w:r>
-      <w:r>
-        <w:t xml:space="preserve"> </w:t>
-      </w:r>
-      <w:r>
-        <w:t xml:space="preserve">A nota tem caráter exclusivamente informativo e reproduz fato objetivo já admitido na contestação. O acordo</w:t>
-      </w:r>
-      <w:r>
-        <w:t xml:space="preserve"> </w:t>
-      </w:r>
-      <w:r>
-        <w:rPr>
-          <w:bCs/>
-          <w:b/>
-        </w:rPr>
-        <w:t xml:space="preserve">não importa reconhecimento</w:t>
-      </w:r>
-      <w:r>
-        <w:t xml:space="preserve"> </w:t>
-      </w:r>
-      <w:r>
-        <w:t xml:space="preserve">de ilicitude, culpa, responsabilidade civil ou penal, nem de inveracidade de qualquer manifestação, e</w:t>
-      </w:r>
-      <w:r>
-        <w:t xml:space="preserve"> </w:t>
-      </w:r>
-      <w:r>
-        <w:rPr>
-          <w:bCs/>
-          <w:b/>
-        </w:rPr>
-        <w:t xml:space="preserve">não implica renúncia</w:t>
-      </w:r>
-      <w:r>
-        <w:t xml:space="preserve"> </w:t>
-      </w:r>
-      <w:r>
-        <w:t xml:space="preserve">à imunidade parlamentar material ou ao exercício da função fiscalizadora inerente ao mandato.</w:t>
-      </w:r>
-    </w:p>
-    <w:p>
-      <w:pPr>
-        <w:pStyle w:val="BodyText"/>
-      </w:pPr>
-      <w:r>
-        <w:rPr>
-          <w:bCs/>
-          <w:b/>
-        </w:rPr>
-        <w:t xml:space="preserve">Cláusula 3ª — Sem obrigações pecuniárias ou de abstenção.</w:t>
-      </w:r>
-      <w:r>
-        <w:t xml:space="preserve"> </w:t>
-      </w:r>
-      <w:r>
-        <w:t xml:space="preserve">Não haverá pagamento de qualquer valor a título de indenização, nem obrigação de remoção de conteúdo ou de abstenção de manifestações futuras.</w:t>
-      </w:r>
-    </w:p>
-    <w:p>
-      <w:pPr>
-        <w:pStyle w:val="BodyText"/>
-      </w:pPr>
-      <w:r>
-        <w:rPr>
-          <w:bCs/>
-          <w:b/>
-        </w:rPr>
-        <w:t xml:space="preserve">Cláusula 4ª — Extinção e quitação.</w:t>
-      </w:r>
-      <w:r>
-        <w:t xml:space="preserve"> </w:t>
-      </w:r>
-      <w:r>
-        <w:t xml:space="preserve">O autor</w:t>
-      </w:r>
-      <w:r>
-        <w:t xml:space="preserve"> </w:t>
-      </w:r>
-      <w:r>
-        <w:rPr>
-          <w:bCs/>
-          <w:b/>
-        </w:rPr>
-        <w:t xml:space="preserve">renuncia ao direito sobre o qual se funda a ação</w:t>
-      </w:r>
-      <w:r>
-        <w:t xml:space="preserve">, requerendo-se a homologação do acordo e a extinção do processo com resolução do mérito (art. 487, III,</w:t>
-      </w:r>
-      <w:r>
-        <w:t xml:space="preserve"> </w:t>
-      </w:r>
-      <w:r>
-        <w:t xml:space="preserve">“</w:t>
-      </w:r>
-      <w:r>
-        <w:t xml:space="preserve">b</w:t>
-      </w:r>
-      <w:r>
-        <w:t xml:space="preserve">”</w:t>
-      </w:r>
-      <w:r>
-        <w:t xml:space="preserve"> </w:t>
-      </w:r>
-      <w:r>
-        <w:t xml:space="preserve">e</w:t>
-      </w:r>
-      <w:r>
-        <w:t xml:space="preserve"> </w:t>
-      </w:r>
-      <w:r>
-        <w:t xml:space="preserve">“</w:t>
-      </w:r>
-      <w:r>
-        <w:t xml:space="preserve">c</w:t>
-      </w:r>
-      <w:r>
-        <w:t xml:space="preserve">”</w:t>
-      </w:r>
-      <w:r>
-        <w:t xml:space="preserve">, do CPC), com</w:t>
-      </w:r>
-      <w:r>
-        <w:t xml:space="preserve"> </w:t>
-      </w:r>
-      <w:r>
-        <w:rPr>
-          <w:bCs/>
-          <w:b/>
-        </w:rPr>
-        <w:t xml:space="preserve">plena, geral e recíproca quitação</w:t>
-      </w:r>
-      <w:r>
-        <w:t xml:space="preserve"> </w:t>
-      </w:r>
-      <w:r>
-        <w:t xml:space="preserve">quanto aos fatos narrados na inicial.</w:t>
-      </w:r>
-    </w:p>
-    <w:p>
-      <w:pPr>
-        <w:pStyle w:val="BodyText"/>
-      </w:pPr>
-      <w:r>
-        <w:rPr>
-          <w:bCs/>
-          <w:b/>
-        </w:rPr>
-        <w:t xml:space="preserve">Cláusula 5ª — Custas e honorários.</w:t>
-      </w:r>
-      <w:r>
-        <w:t xml:space="preserve"> </w:t>
-      </w:r>
-      <w:r>
-        <w:t xml:space="preserve">Cada parte arcará com os honorários de seu advogado. Sem custas, nos termos do art. 54 da Lei nº 9.099/1995.</w:t>
-      </w:r>
-    </w:p>
-    <w:p>
-      <w:pPr>
-        <w:pStyle w:val="BodyText"/>
-      </w:pPr>
-      <w:r>
-        <w:rPr>
-          <w:bCs/>
-          <w:b/>
-        </w:rPr>
-        <w:t xml:space="preserve">Cláusula 6ª — Queixa-crime.</w:t>
-      </w:r>
-      <w:r>
-        <w:t xml:space="preserve"> </w:t>
-      </w:r>
-      <w:r>
-        <w:t xml:space="preserve">[OPCIONAL — confirmar com o cliente] Considerando que os mesmos fatos são objeto da Queixa-Crime nº 0800876-47.2026.8.18.0061, em trâmite neste Juízo, o querelante concede</w:t>
-      </w:r>
-      <w:r>
-        <w:t xml:space="preserve"> </w:t>
-      </w:r>
-      <w:r>
-        <w:rPr>
-          <w:bCs/>
-          <w:b/>
-        </w:rPr>
-        <w:t xml:space="preserve">perdão</w:t>
-      </w:r>
-      <w:r>
-        <w:t xml:space="preserve"> </w:t>
-      </w:r>
-      <w:r>
-        <w:t xml:space="preserve">ao querelado, para os fins dos arts. 105 e 107, V, do Código Penal, comprometendo-se a requerer a extinção da punibilidade naqueles autos no prazo de 5 (cinco) dias da homologação.</w:t>
-      </w:r>
-    </w:p>
-    <w:p>
-      <w:pPr>
-        <w:pStyle w:val="BodyText"/>
-      </w:pPr>
-      <w:r>
-        <w:rPr>
-          <w:bCs/>
-          <w:b/>
-        </w:rPr>
-        <w:t xml:space="preserve">Cláusula 7ª — Descumprimento.</w:t>
-      </w:r>
-      <w:r>
-        <w:t xml:space="preserve"> </w:t>
-      </w:r>
-      <w:r>
-        <w:t xml:space="preserve">O descumprimento da Cláusula 1ª autoriza a execução da obrigação de fazer nos próprios autos (art. 52, V, da Lei nº 9.099/1995).</w:t>
-      </w:r>
-    </w:p>
-    <w:bookmarkEnd w:id="34"/>
-    <w:bookmarkStart w:id="35" w:name="iii.-dos-requerimentos"/>
-    <w:p>
-      <w:pPr>
-        <w:pStyle w:val="Heading2"/>
-      </w:pPr>
-      <w:r>
-        <w:t xml:space="preserve">III. Dos requerimentos</w:t>
-      </w:r>
-    </w:p>
-    <w:p>
-      <w:pPr>
-        <w:pStyle w:val="FirstParagraph"/>
-      </w:pPr>
-      <w:r>
-        <w:t xml:space="preserve">Ante o exposto, requer:</w:t>
-      </w:r>
-    </w:p>
-    <w:p>
-      <w:pPr>
-        <w:numPr>
-          <w:ilvl w:val="0"/>
-          <w:numId w:val="1004"/>
-        </w:numPr>
-        <w:pStyle w:val="Compact"/>
-      </w:pPr>
-      <w:r>
-        <w:t xml:space="preserve">o</w:t>
-      </w:r>
-      <w:r>
-        <w:t xml:space="preserve"> </w:t>
-      </w:r>
-      <w:r>
-        <w:rPr>
-          <w:bCs/>
-          <w:b/>
-        </w:rPr>
-        <w:t xml:space="preserve">registro desta proposta</w:t>
-      </w:r>
-      <w:r>
-        <w:t xml:space="preserve"> </w:t>
-      </w:r>
-      <w:r>
-        <w:t xml:space="preserve">nos autos e em ata;</w:t>
-      </w:r>
-    </w:p>
-    <w:p>
-      <w:pPr>
-        <w:numPr>
-          <w:ilvl w:val="0"/>
-          <w:numId w:val="1004"/>
-        </w:numPr>
-        <w:pStyle w:val="Compact"/>
-      </w:pPr>
-      <w:r>
-        <w:t xml:space="preserve">a</w:t>
-      </w:r>
-      <w:r>
-        <w:t xml:space="preserve"> </w:t>
-      </w:r>
-      <w:r>
-        <w:rPr>
-          <w:bCs/>
-          <w:b/>
-        </w:rPr>
-        <w:t xml:space="preserve">intimação do autor</w:t>
-      </w:r>
-      <w:r>
-        <w:t xml:space="preserve"> </w:t>
-      </w:r>
-      <w:r>
-        <w:t xml:space="preserve">para que se manifeste sobre ela;</w:t>
-      </w:r>
-    </w:p>
-    <w:p>
-      <w:pPr>
-        <w:numPr>
-          <w:ilvl w:val="0"/>
-          <w:numId w:val="1004"/>
-        </w:numPr>
-        <w:pStyle w:val="Compact"/>
-      </w:pPr>
-      <w:r>
-        <w:t xml:space="preserve">em caso de aceitação, a</w:t>
-      </w:r>
-      <w:r>
-        <w:t xml:space="preserve"> </w:t>
-      </w:r>
-      <w:r>
-        <w:rPr>
-          <w:bCs/>
-          <w:b/>
-        </w:rPr>
-        <w:t xml:space="preserve">homologação do acordo</w:t>
-      </w:r>
-      <w:r>
-        <w:t xml:space="preserve"> </w:t>
-      </w:r>
-      <w:r>
-        <w:t xml:space="preserve">por sentença, com resolução do mérito (art. 22, parágrafo único, da Lei nº 9.099/1995; art. 487, III, do CPC);</w:t>
-      </w:r>
-    </w:p>
-    <w:p>
-      <w:pPr>
-        <w:numPr>
-          <w:ilvl w:val="0"/>
-          <w:numId w:val="1004"/>
-        </w:numPr>
-        <w:pStyle w:val="Compact"/>
-      </w:pPr>
-      <w:r>
-        <w:t xml:space="preserve">em caso de recusa, o</w:t>
-      </w:r>
-      <w:r>
-        <w:t xml:space="preserve"> </w:t>
-      </w:r>
-      <w:r>
-        <w:rPr>
-          <w:bCs/>
-          <w:b/>
-        </w:rPr>
-        <w:t xml:space="preserve">registro de que a composição foi inviabilizada pelo autor</w:t>
-      </w:r>
-      <w:r>
-        <w:t xml:space="preserve"> </w:t>
-      </w:r>
-      <w:r>
-        <w:t xml:space="preserve">e o regular prosseguimento do feito, com o julgamento antecipado do mérito (art. 355, I, do CPC).</w:t>
-      </w:r>
-    </w:p>
-    <w:p>
-      <w:pPr>
-        <w:pStyle w:val="FirstParagraph"/>
-        <w:jc w:val="center"/>
-      </w:pPr>
-      <w:r>
-        <w:t xml:space="preserve">Nestes termos, pede deferimento.</w:t>
-      </w:r>
-    </w:p>
-    <w:p>
-      <w:pPr>
-        <w:pStyle w:val="BodyText"/>
-        <w:jc w:val="center"/>
-      </w:pPr>
-      <w:r>
-        <w:t xml:space="preserve">Miguel Alves/PI, 22 de outubro de 2026.</w:t>
-      </w:r>
-    </w:p>
-    <w:p>
-      <w:pPr>
-        <w:pStyle w:val="BodyText"/>
-        <w:jc w:val="center"/>
-      </w:pPr>
-      <w:r>
-        <w:rPr>
-          <w:bCs/>
-          <w:b/>
-        </w:rPr>
-        <w:t xml:space="preserve">ANTÔNIO DE PÁDUA SANTOS NETO</w:t>
-      </w:r>
-      <w:r>
-        <w:br/>
-      </w:r>
-      <w:r>
-        <w:rPr>
-          <w:bCs/>
-          <w:b/>
-        </w:rPr>
-        <w:t xml:space="preserve">OAB/PI nº 21.320</w:t>
-      </w:r>
-    </w:p>
-    <w:bookmarkEnd w:id="35"/>
-    <w:bookmarkEnd w:id="36"/>
     <w:sectPr>
       <w:pgSz w:h="16838" w:w="11906"/>
       <w:pgMar w:bottom="1134" w:footer="567" w:gutter="0" w:header="567" w:left="1418" w:right="1134" w:top="1134"/>
@@ -4293,36 +3564,6 @@
   </w:num>
   <w:num w:numId="1003">
     <w:abstractNumId w:val="991"/>
-  </w:num>
-  <w:num w:numId="1004">
-    <w:abstractNumId w:val="99411"/>
-    <w:lvlOverride w:ilvl="0">
-      <w:startOverride w:val="1"/>
-    </w:lvlOverride>
-    <w:lvlOverride w:ilvl="1">
-      <w:startOverride w:val="1"/>
-    </w:lvlOverride>
-    <w:lvlOverride w:ilvl="2">
-      <w:startOverride w:val="1"/>
-    </w:lvlOverride>
-    <w:lvlOverride w:ilvl="3">
-      <w:startOverride w:val="1"/>
-    </w:lvlOverride>
-    <w:lvlOverride w:ilvl="4">
-      <w:startOverride w:val="1"/>
-    </w:lvlOverride>
-    <w:lvlOverride w:ilvl="5">
-      <w:startOverride w:val="1"/>
-    </w:lvlOverride>
-    <w:lvlOverride w:ilvl="6">
-      <w:startOverride w:val="1"/>
-    </w:lvlOverride>
-    <w:lvlOverride w:ilvl="7">
-      <w:startOverride w:val="1"/>
-    </w:lvlOverride>
-    <w:lvlOverride w:ilvl="8">
-      <w:startOverride w:val="1"/>
-    </w:lvlOverride>
   </w:num>
 </w:numbering>
 </file>

</xml_diff>

<commit_message>
Roteiro: pedido sobre a procuração no Cenário B (autor presente) e mandato verbal
Co-Authored-By: Claude Opus 5.5 <noreply@anthropic.com>
Claude-Session: https://claude.ai/code/session_01CUmiv8ZKDC5VxLQ3BigcLo
</commit_message>
<xml_diff>
--- a/0800990-83.2026 - Ely Sandro/Pedido oral - audiência de conciliação 22-10-2026.docx
+++ b/0800990-83.2026 - Ely Sandro/Pedido oral - audiência de conciliação 22-10-2026.docx
@@ -2206,7 +2206,7 @@
         <w:t xml:space="preserve">ausência de procuração do autor nos autos</w:t>
       </w:r>
       <w:r>
-        <w:t xml:space="preserve">, embora a inicial afirme</w:t>
+        <w:t xml:space="preserve">. A inicial afirma</w:t>
       </w:r>
       <w:r>
         <w:t xml:space="preserve"> </w:t>
@@ -2215,13 +2215,73 @@
         <w:t xml:space="preserve">“</w:t>
       </w:r>
       <w:r>
+        <w:t xml:space="preserve">instrumento procuratório com poderes ad judicia et extra em anexo</w:t>
+      </w:r>
+      <w:r>
+        <w:t xml:space="preserve">”</w:t>
+      </w:r>
+      <w:r>
+        <w:t xml:space="preserve"> </w:t>
+      </w:r>
+      <w:r>
+        <w:t xml:space="preserve">e</w:t>
+      </w:r>
+      <w:r>
+        <w:t xml:space="preserve"> </w:t>
+      </w:r>
+      <w:r>
+        <w:t xml:space="preserve">“</w:t>
+      </w:r>
+      <w:r>
         <w:t xml:space="preserve">procuração em anexo</w:t>
       </w:r>
       <w:r>
         <w:t xml:space="preserve">”</w:t>
       </w:r>
       <w:r>
-        <w:t xml:space="preserve">, e requer a intimação do autor para regularizar a representação, sob pena de extinção (arts. 76, § 1º, I, e 485, IV, do CPC; art. 104, § 2º, do CPC).</w:t>
+        <w:t xml:space="preserve">, mas nenhum dos documentos juntados em 08/07/2026 é instrumento de mandato. Todos os atos praticados em nome do autor, inclusive a inicial, o pedido de tutela de urgência e a petição de ID 107306168, foram subscritos por advogado</w:t>
+      </w:r>
+      <w:r>
+        <w:t xml:space="preserve"> </w:t>
+      </w:r>
+      <w:r>
+        <w:rPr>
+          <w:bCs/>
+          <w:b/>
+        </w:rPr>
+        <w:t xml:space="preserve">sem mandato nos autos</w:t>
+      </w:r>
+      <w:r>
+        <w:t xml:space="preserve">. O prazo do art. 104, § 1º, do CPC, de 15 dias prorrogáveis por igual período,</w:t>
+      </w:r>
+      <w:r>
+        <w:t xml:space="preserve"> </w:t>
+      </w:r>
+      <w:r>
+        <w:rPr>
+          <w:bCs/>
+          <w:b/>
+        </w:rPr>
+        <w:t xml:space="preserve">há muito se esgotou</w:t>
+      </w:r>
+      <w:r>
+        <w:t xml:space="preserve">, e os atos não ratificados são</w:t>
+      </w:r>
+      <w:r>
+        <w:t xml:space="preserve"> </w:t>
+      </w:r>
+      <w:r>
+        <w:rPr>
+          <w:bCs/>
+          <w:b/>
+        </w:rPr>
+        <w:t xml:space="preserve">ineficazes</w:t>
+      </w:r>
+      <w:r>
+        <w:t xml:space="preserve"> </w:t>
+      </w:r>
+      <w:r>
+        <w:t xml:space="preserve">em relação ao autor (art. 104, § 2º, do CPC).</w:t>
       </w:r>
     </w:p>
     <w:p>
@@ -2229,6 +2289,175 @@
         <w:pStyle w:val="BlockText"/>
       </w:pPr>
       <w:r>
+        <w:t xml:space="preserve">Diante disso, requer:</w:t>
+      </w:r>
+      <w:r>
+        <w:t xml:space="preserve"> </w:t>
+      </w:r>
+      <w:r>
+        <w:rPr>
+          <w:bCs/>
+          <w:b/>
+        </w:rPr>
+        <w:t xml:space="preserve">(a)</w:t>
+      </w:r>
+      <w:r>
+        <w:t xml:space="preserve"> </w:t>
+      </w:r>
+      <w:r>
+        <w:t xml:space="preserve">o</w:t>
+      </w:r>
+      <w:r>
+        <w:t xml:space="preserve"> </w:t>
+      </w:r>
+      <w:r>
+        <w:rPr>
+          <w:bCs/>
+          <w:b/>
+        </w:rPr>
+        <w:t xml:space="preserve">registro em ata</w:t>
+      </w:r>
+      <w:r>
+        <w:t xml:space="preserve"> </w:t>
+      </w:r>
+      <w:r>
+        <w:t xml:space="preserve">da ausência de procuração;</w:t>
+      </w:r>
+      <w:r>
+        <w:t xml:space="preserve"> </w:t>
+      </w:r>
+      <w:r>
+        <w:rPr>
+          <w:bCs/>
+          <w:b/>
+        </w:rPr>
+        <w:t xml:space="preserve">(b)</w:t>
+      </w:r>
+      <w:r>
+        <w:t xml:space="preserve"> </w:t>
+      </w:r>
+      <w:r>
+        <w:t xml:space="preserve">a</w:t>
+      </w:r>
+      <w:r>
+        <w:t xml:space="preserve"> </w:t>
+      </w:r>
+      <w:r>
+        <w:rPr>
+          <w:bCs/>
+          <w:b/>
+        </w:rPr>
+        <w:t xml:space="preserve">intimação do autor para juntar instrumento de mandato e ratificar expressamente os atos praticados</w:t>
+      </w:r>
+      <w:r>
+        <w:t xml:space="preserve">, em prazo</w:t>
+      </w:r>
+      <w:r>
+        <w:t xml:space="preserve"> </w:t>
+      </w:r>
+      <w:r>
+        <w:rPr>
+          <w:bCs/>
+          <w:b/>
+        </w:rPr>
+        <w:t xml:space="preserve">improrrogável</w:t>
+      </w:r>
+      <w:r>
+        <w:t xml:space="preserve">, sob pena de</w:t>
+      </w:r>
+      <w:r>
+        <w:t xml:space="preserve"> </w:t>
+      </w:r>
+      <w:r>
+        <w:rPr>
+          <w:bCs/>
+          <w:b/>
+        </w:rPr>
+        <w:t xml:space="preserve">extinção do processo sem resolução do mérito</w:t>
+      </w:r>
+      <w:r>
+        <w:t xml:space="preserve"> </w:t>
+      </w:r>
+      <w:r>
+        <w:t xml:space="preserve">(arts. 76, § 1º, I, e 485, IV, do CPC); e</w:t>
+      </w:r>
+      <w:r>
+        <w:t xml:space="preserve"> </w:t>
+      </w:r>
+      <w:r>
+        <w:rPr>
+          <w:bCs/>
+          <w:b/>
+        </w:rPr>
+        <w:t xml:space="preserve">(c)</w:t>
+      </w:r>
+      <w:r>
+        <w:t xml:space="preserve"> </w:t>
+      </w:r>
+      <w:r>
+        <w:t xml:space="preserve">caso o autor pretenda outorgar mandato verbal neste ato (art. 9º, § 3º, da Lei 9.099/95), que conste em ata que o mandato</w:t>
+      </w:r>
+      <w:r>
+        <w:t xml:space="preserve"> </w:t>
+      </w:r>
+      <w:r>
+        <w:rPr>
+          <w:bCs/>
+          <w:b/>
+        </w:rPr>
+        <w:t xml:space="preserve">abrange apenas os poderes gerais do foro</w:t>
+      </w:r>
+      <w:r>
+        <w:t xml:space="preserve">, pois os</w:t>
+      </w:r>
+      <w:r>
+        <w:t xml:space="preserve"> </w:t>
+      </w:r>
+      <w:r>
+        <w:rPr>
+          <w:bCs/>
+          <w:b/>
+        </w:rPr>
+        <w:t xml:space="preserve">poderes especiais</w:t>
+      </w:r>
+      <w:r>
+        <w:t xml:space="preserve"> </w:t>
+      </w:r>
+      <w:r>
+        <w:t xml:space="preserve">(art. 105 do CPC: transigir, desistir, renunciar, receber, dar quitação, entre outros)</w:t>
+      </w:r>
+      <w:r>
+        <w:t xml:space="preserve"> </w:t>
+      </w:r>
+      <w:r>
+        <w:rPr>
+          <w:bCs/>
+          <w:b/>
+        </w:rPr>
+        <w:t xml:space="preserve">não podem ser conferidos verbalmente</w:t>
+      </w:r>
+      <w:r>
+        <w:t xml:space="preserve">, e que a ratificação dos atos anteriores seja</w:t>
+      </w:r>
+      <w:r>
+        <w:t xml:space="preserve"> </w:t>
+      </w:r>
+      <w:r>
+        <w:rPr>
+          <w:bCs/>
+          <w:b/>
+        </w:rPr>
+        <w:t xml:space="preserve">expressa</w:t>
+      </w:r>
+      <w:r>
+        <w:t xml:space="preserve">.</w:t>
+      </w:r>
+    </w:p>
+    <w:p>
+      <w:pPr>
+        <w:pStyle w:val="BlockText"/>
+      </w:pPr>
+      <w:r>
         <w:t xml:space="preserve">Requer, assim, o</w:t>
       </w:r>
       <w:r>
@@ -2286,6 +2515,74 @@
       </w:pPr>
       <w:r>
         <w:t xml:space="preserve">São os requerimentos.”</w:t>
+      </w:r>
+    </w:p>
+    <w:p>
+      <w:pPr>
+        <w:pStyle w:val="FirstParagraph"/>
+      </w:pPr>
+      <w:r>
+        <w:rPr>
+          <w:bCs/>
+          <w:b/>
+        </w:rPr>
+        <w:t xml:space="preserve">Se o autor outorgar mandato verbal em ata (art. 9º, § 3º):</w:t>
+      </w:r>
+    </w:p>
+    <w:p>
+      <w:pPr>
+        <w:pStyle w:val="BlockText"/>
+      </w:pPr>
+      <w:r>
+        <w:t xml:space="preserve">“</w:t>
+      </w:r>
+      <w:r>
+        <w:t xml:space="preserve">Excelência, a defesa não se opõe ao registro, mas requer que conste: (i) que, até este ato,</w:t>
+      </w:r>
+      <w:r>
+        <w:t xml:space="preserve"> </w:t>
+      </w:r>
+      <w:r>
+        <w:rPr>
+          <w:bCs/>
+          <w:b/>
+        </w:rPr>
+        <w:t xml:space="preserve">não havia procuração nos autos</w:t>
+      </w:r>
+      <w:r>
+        <w:t xml:space="preserve">; (ii) que o mandato verbal abrange</w:t>
+      </w:r>
+      <w:r>
+        <w:t xml:space="preserve"> </w:t>
+      </w:r>
+      <w:r>
+        <w:rPr>
+          <w:bCs/>
+          <w:b/>
+        </w:rPr>
+        <w:t xml:space="preserve">apenas os poderes gerais do foro</w:t>
+      </w:r>
+      <w:r>
+        <w:t xml:space="preserve">, sem poderes especiais, que exigem instrumento escrito (art. 9º, § 3º, da Lei 9.099/95; art. 105 do CPC); e (iii) a</w:t>
+      </w:r>
+      <w:r>
+        <w:t xml:space="preserve"> </w:t>
+      </w:r>
+      <w:r>
+        <w:rPr>
+          <w:bCs/>
+          <w:b/>
+        </w:rPr>
+        <w:t xml:space="preserve">ratificação expressa</w:t>
+      </w:r>
+      <w:r>
+        <w:t xml:space="preserve"> </w:t>
+      </w:r>
+      <w:r>
+        <w:t xml:space="preserve">pelo autor dos atos praticados sem mandato (art. 104, § 2º, do CPC). Para atos que exijam poderes especiais, requer a juntada de instrumento escrito.</w:t>
+      </w:r>
+      <w:r>
+        <w:t xml:space="preserve">”</w:t>
       </w:r>
     </w:p>
     <w:p>

</xml_diff>

<commit_message>
Roteiro: bloco próprio de ratificação da contestação em ata (art. 30 da Lei 9.099)
Co-Authored-By: Claude Opus 5.5 <noreply@anthropic.com>
Claude-Session: https://claude.ai/code/session_01CUmiv8ZKDC5VxLQ3BigcLo
</commit_message>
<xml_diff>
--- a/0800990-83.2026 - Ely Sandro/Pedido oral - audiência de conciliação 22-10-2026.docx
+++ b/0800990-83.2026 - Ely Sandro/Pedido oral - audiência de conciliação 22-10-2026.docx
@@ -2,7 +2,7 @@
 <file path=word/document.xml><?xml version="1.0" encoding="utf-8"?>
 <w:document xmlns:w="http://schemas.openxmlformats.org/wordprocessingml/2006/main" xmlns:m="http://schemas.openxmlformats.org/officeDocument/2006/math" xmlns:r="http://schemas.openxmlformats.org/officeDocument/2006/relationships" xmlns:o="urn:schemas-microsoft-com:office:office" xmlns:v="urn:schemas-microsoft-com:vml" xmlns:w10="urn:schemas-microsoft-com:office:word" xmlns:a="http://schemas.openxmlformats.org/drawingml/2006/main" xmlns:pic="http://schemas.openxmlformats.org/drawingml/2006/picture" xmlns:wp="http://schemas.openxmlformats.org/drawingml/2006/wordprocessingDrawing">
   <w:body>
-    <w:bookmarkStart w:id="31" w:name="Xa28dfabad047e90ef0866cbad0bdd7a86ecae39"/>
+    <w:bookmarkStart w:id="32" w:name="Xa28dfabad047e90ef0866cbad0bdd7a86ecae39"/>
     <w:p>
       <w:pPr>
         <w:pStyle w:val="Heading1"/>
@@ -2104,7 +2104,23 @@
           <w:bCs/>
           <w:b/>
         </w:rPr>
-        <w:t xml:space="preserve">ratifica neste ato a contestação de ID 106243575 e os documentos que a instruem</w:t>
+        <w:t xml:space="preserve">ratifica integralmente e apresenta neste ato a contestação de ID 106243575 e os documentos que a instruem</w:t>
+      </w:r>
+      <w:r>
+        <w:t xml:space="preserve"> </w:t>
+      </w:r>
+      <w:r>
+        <w:t xml:space="preserve">(art. 30 da Lei 9.099/95), nos termos do bloco</w:t>
+      </w:r>
+      <w:r>
+        <w:t xml:space="preserve"> </w:t>
+      </w:r>
+      <w:r>
+        <w:rPr>
+          <w:iCs/>
+          <w:i/>
+        </w:rPr>
+        <w:t xml:space="preserve">Ratificação da contestação</w:t>
       </w:r>
       <w:r>
         <w:t xml:space="preserve">, requerendo que conste em ata.</w:t>
@@ -2945,12 +2961,257 @@
     </w:p>
     <w:bookmarkEnd w:id="26"/>
     <w:bookmarkEnd w:id="27"/>
-    <w:bookmarkStart w:id="28" w:name="X6ddbc57cd36f29febb9415e2785fb01386765c4"/>
+    <w:bookmarkStart w:id="28" w:name="X905fbb9dc32468116973f1859db3c83e7e24b74"/>
     <w:p>
       <w:pPr>
         <w:pStyle w:val="Heading2"/>
       </w:pPr>
       <w:r>
+        <w:t xml:space="preserve">Ratificação da contestação (Cenários A, se não houver extinção, B e C1)</w:t>
+      </w:r>
+    </w:p>
+    <w:p>
+      <w:pPr>
+        <w:pStyle w:val="BlockText"/>
+      </w:pPr>
+      <w:r>
+        <w:t xml:space="preserve">“Excelência, a defesa requer que conste em ata que o requerido</w:t>
+      </w:r>
+      <w:r>
+        <w:t xml:space="preserve"> </w:t>
+      </w:r>
+      <w:r>
+        <w:rPr>
+          <w:bCs/>
+          <w:b/>
+        </w:rPr>
+        <w:t xml:space="preserve">Ely Sandro Vaz e Silva</w:t>
+      </w:r>
+      <w:r>
+        <w:t xml:space="preserve">, presente pessoalmente e assistido por seu advogado,</w:t>
+      </w:r>
+      <w:r>
+        <w:t xml:space="preserve"> </w:t>
+      </w:r>
+      <w:r>
+        <w:rPr>
+          <w:bCs/>
+          <w:b/>
+        </w:rPr>
+        <w:t xml:space="preserve">ratifica integralmente a contestação de ID 106243575 e todos os documentos que a instruem</w:t>
+      </w:r>
+      <w:r>
+        <w:t xml:space="preserve">, e a</w:t>
+      </w:r>
+      <w:r>
+        <w:t xml:space="preserve"> </w:t>
+      </w:r>
+      <w:r>
+        <w:rPr>
+          <w:bCs/>
+          <w:b/>
+        </w:rPr>
+        <w:t xml:space="preserve">apresenta neste ato</w:t>
+      </w:r>
+      <w:r>
+        <w:t xml:space="preserve">, para todos os fins, nos termos do</w:t>
+      </w:r>
+      <w:r>
+        <w:t xml:space="preserve"> </w:t>
+      </w:r>
+      <w:r>
+        <w:rPr>
+          <w:bCs/>
+          <w:b/>
+        </w:rPr>
+        <w:t xml:space="preserve">art. 30 da Lei nº 9.099/1995</w:t>
+      </w:r>
+      <w:r>
+        <w:t xml:space="preserve">, segundo o qual a contestação, oral ou escrita, é apresentada na audiência.</w:t>
+      </w:r>
+    </w:p>
+    <w:p>
+      <w:pPr>
+        <w:pStyle w:val="BlockText"/>
+      </w:pPr>
+      <w:r>
+        <w:t xml:space="preserve">Reitera, assim,</w:t>
+      </w:r>
+      <w:r>
+        <w:t xml:space="preserve"> </w:t>
+      </w:r>
+      <w:r>
+        <w:rPr>
+          <w:bCs/>
+          <w:b/>
+        </w:rPr>
+        <w:t xml:space="preserve">todas as preliminares</w:t>
+      </w:r>
+      <w:r>
+        <w:t xml:space="preserve"> </w:t>
+      </w:r>
+      <w:r>
+        <w:t xml:space="preserve">(tempestividade, ilegitimidade ativa quanto a familiares e terceiros e inépcia parcial do pedido genérico de abstenção),</w:t>
+      </w:r>
+      <w:r>
+        <w:t xml:space="preserve"> </w:t>
+      </w:r>
+      <w:r>
+        <w:rPr>
+          <w:bCs/>
+          <w:b/>
+        </w:rPr>
+        <w:t xml:space="preserve">toda a matéria de mérito</w:t>
+      </w:r>
+      <w:r>
+        <w:t xml:space="preserve">, em especial a</w:t>
+      </w:r>
+      <w:r>
+        <w:t xml:space="preserve"> </w:t>
+      </w:r>
+      <w:r>
+        <w:rPr>
+          <w:bCs/>
+          <w:b/>
+        </w:rPr>
+        <w:t xml:space="preserve">imunidade parlamentar material</w:t>
+      </w:r>
+      <w:r>
+        <w:t xml:space="preserve"> </w:t>
+      </w:r>
+      <w:r>
+        <w:t xml:space="preserve">(art. 29, VIII, da CF; Tema 469 do STF), e</w:t>
+      </w:r>
+      <w:r>
+        <w:t xml:space="preserve"> </w:t>
+      </w:r>
+      <w:r>
+        <w:rPr>
+          <w:bCs/>
+          <w:b/>
+        </w:rPr>
+        <w:t xml:space="preserve">todos os requerimentos de prova</w:t>
+      </w:r>
+      <w:r>
+        <w:t xml:space="preserve">, inclusive a requisição à Câmara Municipal de Miguel Alves das atas e gravações integrais das sessões de 27/02, 13/03, 27/03 e 09/05/2026 e o depoimento pessoal do autor.</w:t>
+      </w:r>
+    </w:p>
+    <w:p>
+      <w:pPr>
+        <w:pStyle w:val="BlockText"/>
+      </w:pPr>
+      <w:r>
+        <w:t xml:space="preserve">Requer, por fim, que a defesa seja</w:t>
+      </w:r>
+      <w:r>
+        <w:t xml:space="preserve"> </w:t>
+      </w:r>
+      <w:r>
+        <w:rPr>
+          <w:bCs/>
+          <w:b/>
+        </w:rPr>
+        <w:t xml:space="preserve">recebida como apresentada nesta audiência</w:t>
+      </w:r>
+      <w:r>
+        <w:t xml:space="preserve">, o que afasta qualquer alegação de revelia, nos termos dos</w:t>
+      </w:r>
+      <w:r>
+        <w:t xml:space="preserve"> </w:t>
+      </w:r>
+      <w:r>
+        <w:rPr>
+          <w:bCs/>
+          <w:b/>
+        </w:rPr>
+        <w:t xml:space="preserve">Enunciados 10 e 11 do FONAJE</w:t>
+      </w:r>
+      <w:r>
+        <w:t xml:space="preserve">: a contestação pode ser apresentada até a audiência de instrução e julgamento e, nas causas de valor superior a vinte salários mínimos, a revelia só decorre da sua ausência, o que não ocorre.”</w:t>
+      </w:r>
+    </w:p>
+    <w:p>
+      <w:pPr>
+        <w:pStyle w:val="FirstParagraph"/>
+      </w:pPr>
+      <w:r>
+        <w:rPr>
+          <w:bCs/>
+          <w:b/>
+        </w:rPr>
+        <w:t xml:space="preserve">Conferir na ata:</w:t>
+      </w:r>
+      <w:r>
+        <w:t xml:space="preserve"> </w:t>
+      </w:r>
+      <w:r>
+        <w:t xml:space="preserve">(i) presença pessoal do réu; (ii) ratificação</w:t>
+      </w:r>
+      <w:r>
+        <w:t xml:space="preserve"> </w:t>
+      </w:r>
+      <w:r>
+        <w:rPr>
+          <w:bCs/>
+          <w:b/>
+        </w:rPr>
+        <w:t xml:space="preserve">integral</w:t>
+      </w:r>
+      <w:r>
+        <w:t xml:space="preserve"> </w:t>
+      </w:r>
+      <w:r>
+        <w:t xml:space="preserve">da contestação de ID 106243575</w:t>
+      </w:r>
+      <w:r>
+        <w:t xml:space="preserve"> </w:t>
+      </w:r>
+      <w:r>
+        <w:rPr>
+          <w:bCs/>
+          <w:b/>
+        </w:rPr>
+        <w:t xml:space="preserve">e documentos</w:t>
+      </w:r>
+      <w:r>
+        <w:t xml:space="preserve">; (iii) menção ao</w:t>
+      </w:r>
+      <w:r>
+        <w:t xml:space="preserve"> </w:t>
+      </w:r>
+      <w:r>
+        <w:rPr>
+          <w:bCs/>
+          <w:b/>
+        </w:rPr>
+        <w:t xml:space="preserve">art. 30 da Lei 9.099/95</w:t>
+      </w:r>
+      <w:r>
+        <w:t xml:space="preserve"> </w:t>
+      </w:r>
+      <w:r>
+        <w:t xml:space="preserve">(</w:t>
+      </w:r>
+      <w:r>
+        <w:t xml:space="preserve">“</w:t>
+      </w:r>
+      <w:r>
+        <w:t xml:space="preserve">apresentada neste ato</w:t>
+      </w:r>
+      <w:r>
+        <w:t xml:space="preserve">”</w:t>
+      </w:r>
+      <w:r>
+        <w:t xml:space="preserve">); (iv) reiteração das preliminares, do mérito e das provas.</w:t>
+      </w:r>
+    </w:p>
+    <w:bookmarkEnd w:id="28"/>
+    <w:bookmarkStart w:id="29" w:name="X6ddbc57cd36f29febb9415e2785fb01386765c4"/>
+    <w:p>
+      <w:pPr>
+        <w:pStyle w:val="Heading2"/>
+      </w:pPr>
+      <w:r>
         <w:t xml:space="preserve">Se o autor alegar intempestividade da contestação (qualquer cenário)</w:t>
       </w:r>
     </w:p>
@@ -3092,8 +3353,8 @@
         <w:t xml:space="preserve">: ainda que se conte da ciência da citação, a defesa pode ser apresentada até a audiência de instrução, que sequer foi designada. De todo modo, a decisão de ID 100909958 fixou expressamente o art. 231 do CPC como termo inicial. O próprio prazo de 15 dias para contestação escrita não existe na Lei 9.099; é criação do CPC (art. 335) adotada pelo Juízo, e por isso o seu termo inicial segue o sistema do CPC que o Juízo expressamente indicou. Um comando judicial específico, dirigido à parte, prevalece sobre orientação genérica de enunciado. A defesa observou esse marco, em atenção à boa-fé e à proteção da confiança (arts. 5º e 6º do CPC), e, subsidiariamente, há justa causa (art. 223, §§ 1º e 2º, do CPC).”</w:t>
       </w:r>
     </w:p>
-    <w:bookmarkEnd w:id="28"/>
-    <w:bookmarkStart w:id="29" w:name="cuidados-durante-o-ato"/>
+    <w:bookmarkEnd w:id="29"/>
+    <w:bookmarkStart w:id="30" w:name="cuidados-durante-o-ato"/>
     <w:p>
       <w:pPr>
         <w:pStyle w:val="Heading2"/>
@@ -3115,13 +3376,26 @@
           <w:bCs/>
           <w:b/>
         </w:rPr>
-        <w:t xml:space="preserve">Em qualquer cenário em que o processo prossiga, ratificar a contestação em ata.</w:t>
-      </w:r>
-      <w:r>
-        <w:t xml:space="preserve"> </w:t>
-      </w:r>
-      <w:r>
-        <w:t xml:space="preserve">Valor da causa (R$ 60.000,00) supera 20 salários mínimos: pelo Enunciado 11 do FONAJE, a revelia aqui depende da ausência de contestação; a ratificação resolve também o risco do Enunciado 13.</w:t>
+        <w:t xml:space="preserve">Em qualquer cenário em que o processo prossiga, ratificar a contestação em ata</w:t>
+      </w:r>
+      <w:r>
+        <w:t xml:space="preserve"> </w:t>
+      </w:r>
+      <w:r>
+        <w:t xml:space="preserve">(bloco</w:t>
+      </w:r>
+      <w:r>
+        <w:t xml:space="preserve"> </w:t>
+      </w:r>
+      <w:r>
+        <w:rPr>
+          <w:iCs/>
+          <w:i/>
+        </w:rPr>
+        <w:t xml:space="preserve">Ratificação da contestação</w:t>
+      </w:r>
+      <w:r>
+        <w:t xml:space="preserve">). Valor da causa (R$ 60.000,00) supera 20 salários mínimos: pelo Enunciado 11 do FONAJE, a revelia aqui depende da ausência de contestação; a ratificação resolve também o risco do Enunciado 13.</w:t>
       </w:r>
     </w:p>
     <w:p>
@@ -3240,8 +3514,8 @@
         <w:t xml:space="preserve">: ausência do autor (se for o caso), presença pessoal do réu, ratificação da contestação e o pedido de extinção com o fundamento (art. 51, I e § 2º).</w:t>
       </w:r>
     </w:p>
-    <w:bookmarkEnd w:id="29"/>
-    <w:bookmarkStart w:id="30" w:name="cartão-de-citações-para-leitura-rápida"/>
+    <w:bookmarkEnd w:id="30"/>
+    <w:bookmarkStart w:id="31" w:name="cartão-de-citações-para-leitura-rápida"/>
     <w:p>
       <w:pPr>
         <w:pStyle w:val="Heading2"/>
@@ -3551,8 +3825,8 @@
         </w:tc>
       </w:tr>
     </w:tbl>
-    <w:bookmarkEnd w:id="30"/>
     <w:bookmarkEnd w:id="31"/>
+    <w:bookmarkEnd w:id="32"/>
     <w:sectPr>
       <w:pgSz w:h="16838" w:w="11906"/>
       <w:pgMar w:bottom="1134" w:footer="567" w:gutter="0" w:header="567" w:left="1418" w:right="1134" w:top="1134"/>

</xml_diff>